<commit_message>
feat: modulo compromisos, RepoSUNAT, mejoras ribot (padron, resolutivo, texto libre, modelos) y odi
Co-Authored-By: Claude Sonnet 5.5 <noreply@anthropic.com>
</commit_message>
<xml_diff>
--- a/app/modulos/ribot/plantillas/MODELO DJR.docx
+++ b/app/modulos/ribot/plantillas/MODELO DJR.docx
@@ -19,16 +19,16 @@
           <w:lang w:val="en-US"/>
         </w:rPr>
         <w:drawing>
-          <wp:anchor distT="0" distB="0" distL="114300" distR="114300" simplePos="0" relativeHeight="251659264" behindDoc="1" locked="0" layoutInCell="1" allowOverlap="1" wp14:anchorId="0A403291" wp14:editId="46FA5572">
+          <wp:anchor distT="0" distB="0" distL="114300" distR="114300" simplePos="0" relativeHeight="251659264" behindDoc="1" locked="0" layoutInCell="1" allowOverlap="1" wp14:anchorId="0A403291" wp14:editId="122837D1">
             <wp:simplePos x="0" y="0"/>
             <wp:positionH relativeFrom="margin">
-              <wp:align>center</wp:align>
+              <wp:posOffset>3092450</wp:posOffset>
             </wp:positionH>
             <wp:positionV relativeFrom="paragraph">
-              <wp:posOffset>50862</wp:posOffset>
+              <wp:posOffset>48895</wp:posOffset>
             </wp:positionV>
-            <wp:extent cx="1327150" cy="1210945"/>
-            <wp:effectExtent l="0" t="0" r="6350" b="8255"/>
+            <wp:extent cx="1224280" cy="1116965"/>
+            <wp:effectExtent l="0" t="0" r="0" b="6985"/>
             <wp:wrapSquare wrapText="right"/>
             <wp:docPr id="6" name="Imagen 6" descr="imagen"/>
             <wp:cNvGraphicFramePr>
@@ -59,7 +59,7 @@
                   <pic:spPr bwMode="auto">
                     <a:xfrm>
                       <a:off x="0" y="0"/>
-                      <a:ext cx="1327150" cy="1210945"/>
+                      <a:ext cx="1224280" cy="1116965"/>
                     </a:xfrm>
                     <a:prstGeom prst="rect">
                       <a:avLst/>
@@ -141,26 +141,35 @@
           <w:szCs w:val="36"/>
         </w:rPr>
       </w:pPr>
-    </w:p>
-    <w:p>
-      <w:pPr>
-        <w:spacing w:after="0" w:line="200" w:lineRule="atLeast"/>
-        <w:jc w:val="center"/>
+      <w:r>
         <w:rPr>
           <w:rFonts w:ascii="Arial" w:hAnsi="Arial" w:cs="Arial"/>
           <w:b/>
           <w:sz w:val="36"/>
           <w:szCs w:val="36"/>
         </w:rPr>
-      </w:pPr>
-      <w:r>
+        <w:t>SUNAT</w:t>
+      </w:r>
+    </w:p>
+    <w:p>
+      <w:pPr>
+        <w:spacing w:after="0" w:line="200" w:lineRule="atLeast"/>
+        <w:jc w:val="center"/>
         <w:rPr>
           <w:rFonts w:ascii="Arial" w:hAnsi="Arial" w:cs="Arial"/>
           <w:b/>
-          <w:sz w:val="36"/>
-          <w:szCs w:val="36"/>
-        </w:rPr>
-        <w:t>SUNAT</w:t>
+          <w:sz w:val="24"/>
+          <w:szCs w:val="24"/>
+        </w:rPr>
+      </w:pPr>
+      <w:r>
+        <w:rPr>
+          <w:rFonts w:ascii="Arial" w:hAnsi="Arial" w:cs="Arial"/>
+          <w:b/>
+          <w:sz w:val="24"/>
+          <w:szCs w:val="24"/>
+        </w:rPr>
+        <w:t>INTENDENCIA DE TRIBUTOS INTERNOS JUNIN</w:t>
       </w:r>
     </w:p>
     <w:p>
@@ -269,26 +278,26 @@
           <w:rFonts w:ascii="Arial" w:hAnsi="Arial" w:cs="Arial"/>
           <w:sz w:val="20"/>
           <w:szCs w:val="20"/>
-          <w:lang w:val="es-ES_tradnl"/>
-        </w:rPr>
-      </w:pPr>
-      <w:r>
-        <w:rPr>
-          <w:rFonts w:ascii="Arial" w:hAnsi="Arial" w:cs="Arial"/>
-          <w:sz w:val="20"/>
-          <w:szCs w:val="20"/>
-          <w:lang w:val="es-ES_tradnl"/>
-        </w:rPr>
-        <w:t>{{CIUDAD}}, {{FECHA_RES}}</w:t>
-      </w:r>
-      <w:r>
-        <w:rPr>
-          <w:rFonts w:ascii="Arial" w:hAnsi="Arial" w:cs="Arial"/>
-          <w:sz w:val="20"/>
-          <w:szCs w:val="20"/>
-          <w:lang w:val="es-ES_tradnl"/>
-        </w:rPr>
-        <w:t>.</w:t>
+          <w:lang w:val="es-ES"/>
+        </w:rPr>
+      </w:pPr>
+      <w:r>
+        <w:rPr>
+          <w:rFonts w:ascii="Arial" w:hAnsi="Arial" w:cs="Arial"/>
+          <w:sz w:val="20"/>
+          <w:szCs w:val="20"/>
+          <w:lang w:val="es-ES_tradnl"/>
+        </w:rPr>
+        <w:t xml:space="preserve">Huancayo, </w:t>
+      </w:r>
+      <w:r>
+        <w:rPr>
+          <w:rFonts w:ascii="Arial" w:hAnsi="Arial" w:cs="Arial"/>
+          <w:sz w:val="20"/>
+          <w:szCs w:val="20"/>
+          <w:lang w:val="es-ES_tradnl"/>
+        </w:rPr>
+        <w:t>{{FECHA_RES}}</w:t>
       </w:r>
     </w:p>
     <w:p>
@@ -391,7 +400,7 @@
           <w:sz w:val="20"/>
           <w:szCs w:val="20"/>
         </w:rPr>
-        <w:t>-</w:t>
+        <w:t>generado por la emisión de oficio del</w:t>
       </w:r>
       <w:r>
         <w:rPr>
@@ -470,7 +479,17 @@
           <w:szCs w:val="20"/>
           <w:lang w:val="es-ES_tradnl"/>
         </w:rPr>
-        <w:t xml:space="preserve">, identificado con RUC </w:t>
+        <w:t xml:space="preserve">, </w:t>
+      </w:r>
+      <w:r>
+        <w:rPr>
+          <w:rFonts w:ascii="Arial" w:hAnsi="Arial" w:cs="Arial"/>
+          <w:bCs/>
+          <w:sz w:val="20"/>
+          <w:szCs w:val="20"/>
+          <w:lang w:val="es-ES_tradnl"/>
+        </w:rPr>
+        <w:t xml:space="preserve">identificado con RUC </w:t>
       </w:r>
       <w:proofErr w:type="spellStart"/>
       <w:r>
@@ -536,10 +555,10 @@
       </w:r>
       <w:r>
         <w:rPr>
-          <w:rFonts w:ascii="Arial" w:hAnsi="Arial" w:cs="Arial"/>
-          <w:bCs/>
-          <w:sz w:val="20"/>
-          <w:szCs w:val="20"/>
+          <w:rFonts w:ascii="Arial" w:eastAsia="Times New Roman" w:hAnsi="Arial" w:cs="Arial"/>
+          <w:sz w:val="20"/>
+          <w:szCs w:val="20"/>
+          <w:lang w:eastAsia="es-ES"/>
         </w:rPr>
         <w:t>{{DOMICILIO}}</w:t>
       </w:r>
@@ -611,77 +630,27 @@
           <w:szCs w:val="20"/>
           <w:lang w:val="es-ES_tradnl"/>
         </w:rPr>
-        <w:t xml:space="preserve">, emitida por emitida por la </w:t>
-      </w:r>
-      <w:r>
-        <w:rPr>
-          <w:noProof/>
-        </w:rPr>
-        <w:drawing>
-          <wp:anchor distT="0" distB="0" distL="114300" distR="114300" simplePos="0" relativeHeight="251679744" behindDoc="1" locked="0" layoutInCell="1" allowOverlap="1" wp14:anchorId="557CD461" wp14:editId="30EC75EA">
-            <wp:simplePos x="0" y="0"/>
-            <wp:positionH relativeFrom="column">
-              <wp:posOffset>0</wp:posOffset>
-            </wp:positionH>
-            <wp:positionV relativeFrom="paragraph">
-              <wp:posOffset>729615</wp:posOffset>
-            </wp:positionV>
-            <wp:extent cx="876453" cy="810055"/>
-            <wp:effectExtent l="0" t="0" r="0" b="9525"/>
-            <wp:wrapNone/>
-            <wp:docPr id="2078249134" name="Imagen 1" descr="Diagrama&#10;&#10;El contenido generado por IA puede ser incorrecto."/>
-            <wp:cNvGraphicFramePr>
-              <a:graphicFrameLocks xmlns:a="http://schemas.openxmlformats.org/drawingml/2006/main" noChangeAspect="1"/>
-            </wp:cNvGraphicFramePr>
-            <a:graphic xmlns:a="http://schemas.openxmlformats.org/drawingml/2006/main">
-              <a:graphicData uri="http://schemas.openxmlformats.org/drawingml/2006/picture">
-                <pic:pic xmlns:pic="http://schemas.openxmlformats.org/drawingml/2006/picture">
-                  <pic:nvPicPr>
-                    <pic:cNvPr id="2078249134" name="Imagen 1" descr="Diagrama&#10;&#10;El contenido generado por IA puede ser incorrecto."/>
-                    <pic:cNvPicPr/>
-                  </pic:nvPicPr>
-                  <pic:blipFill>
-                    <a:blip r:embed="rId12">
-                      <a:extLst>
-                        <a:ext uri="{28A0092B-C50C-407E-A947-70E740481C1C}">
-                          <a14:useLocalDpi xmlns:a14="http://schemas.microsoft.com/office/drawing/2010/main" val="0"/>
-                        </a:ext>
-                      </a:extLst>
-                    </a:blip>
-                    <a:stretch>
-                      <a:fillRect/>
-                    </a:stretch>
-                  </pic:blipFill>
-                  <pic:spPr>
-                    <a:xfrm>
-                      <a:off x="0" y="0"/>
-                      <a:ext cx="876453" cy="810055"/>
-                    </a:xfrm>
-                    <a:prstGeom prst="rect">
-                      <a:avLst/>
-                    </a:prstGeom>
-                  </pic:spPr>
-                </pic:pic>
-              </a:graphicData>
-            </a:graphic>
-            <wp14:sizeRelH relativeFrom="page">
-              <wp14:pctWidth>0</wp14:pctWidth>
-            </wp14:sizeRelH>
-            <wp14:sizeRelV relativeFrom="page">
-              <wp14:pctHeight>0</wp14:pctHeight>
-            </wp14:sizeRelV>
-          </wp:anchor>
-        </w:drawing>
-      </w:r>
-      <w:r>
-        <w:rPr>
-          <w:rFonts w:ascii="Arial" w:hAnsi="Arial" w:cs="Arial"/>
-          <w:bCs/>
-          <w:sz w:val="20"/>
-          <w:szCs w:val="20"/>
-          <w:lang w:val="es-ES_tradnl"/>
-        </w:rPr>
-        <w:t xml:space="preserve">omisión al pago del </w:t>
+        <w:t xml:space="preserve">, emitida </w:t>
+      </w:r>
+      <w:r>
+        <w:rPr>
+          <w:rFonts w:ascii="Arial" w:hAnsi="Arial" w:cs="Arial"/>
+          <w:bCs/>
+          <w:sz w:val="20"/>
+          <w:szCs w:val="20"/>
+          <w:lang w:val="es-ES_tradnl"/>
+        </w:rPr>
+        <w:t xml:space="preserve">por </w:t>
+      </w:r>
+      <w:r>
+        <w:rPr>
+          <w:rFonts w:ascii="Arial" w:hAnsi="Arial" w:cs="Arial"/>
+          <w:bCs/>
+          <w:sz w:val="20"/>
+          <w:szCs w:val="20"/>
+          <w:lang w:val="es-ES_tradnl"/>
+        </w:rPr>
+        <w:t xml:space="preserve">la omisión al pago del </w:t>
       </w:r>
       <w:r>
         <w:rPr>
@@ -701,17 +670,17 @@
           <w:szCs w:val="20"/>
           <w:lang w:val="es-ES"/>
         </w:rPr>
-        <w:t>{{COD_TRIB}},</w:t>
-      </w:r>
-      <w:r>
-        <w:rPr>
-          <w:rFonts w:ascii="Arial" w:hAnsi="Arial" w:cs="Arial"/>
-          <w:bCs/>
-          <w:sz w:val="20"/>
-          <w:szCs w:val="20"/>
-          <w:lang w:val="es-ES_tradnl"/>
-        </w:rPr>
-        <w:t xml:space="preserve"> correspondiente al periodo </w:t>
+        <w:t>{{COD_TRIB}}</w:t>
+      </w:r>
+      <w:r>
+        <w:rPr>
+          <w:rFonts w:ascii="Arial" w:hAnsi="Arial" w:cs="Arial"/>
+          <w:bCs/>
+          <w:sz w:val="20"/>
+          <w:szCs w:val="20"/>
+          <w:lang w:val="es-ES_tradnl"/>
+        </w:rPr>
+        <w:t xml:space="preserve">, correspondiente al periodo </w:t>
       </w:r>
       <w:r>
         <w:rPr>
@@ -798,7 +767,7 @@
         <w:tabs>
           <w:tab w:val="left" w:pos="10206"/>
         </w:tabs>
-        <w:spacing w:after="0" w:line="200" w:lineRule="atLeast"/>
+        <w:spacing w:after="0" w:line="0" w:lineRule="atLeast"/>
         <w:ind w:left="1418" w:right="1418"/>
         <w:jc w:val="both"/>
         <w:rPr>
@@ -811,43 +780,16 @@
       </w:pPr>
       <w:r>
         <w:rPr>
-          <w:rFonts w:ascii="Arial" w:hAnsi="Arial" w:cs="Arial"/>
-          <w:bCs/>
-          <w:sz w:val="20"/>
-          <w:szCs w:val="20"/>
-          <w:lang w:val="es-ES_tradnl"/>
-        </w:rPr>
-        <w:t>Que, el numeral 2 del artículo 108° del Código Tributario, cuyo texto único ordenado fue aprobado por el Decreto Supremo N.° 133-2013-EF, establece que después de la notificación la Administración Tributaria sólo podrá revocar, modificar, sustituir o complementar sus actos, cuando detecte que se han presentado circunstancias posteriores a su emisión que demuestran su improcedencia o cuando se trate de errores materiales, tales como los de redacción o de cálculo.</w:t>
-      </w:r>
-    </w:p>
-    <w:p>
-      <w:pPr>
-        <w:tabs>
-          <w:tab w:val="left" w:pos="10206"/>
-        </w:tabs>
-        <w:spacing w:after="0" w:line="200" w:lineRule="atLeast"/>
-        <w:ind w:left="1418" w:right="1418"/>
-        <w:jc w:val="both"/>
-        <w:rPr>
-          <w:rFonts w:ascii="Arial" w:hAnsi="Arial" w:cs="Arial"/>
-          <w:bCs/>
-          <w:sz w:val="20"/>
-          <w:szCs w:val="20"/>
-          <w:lang w:val="es-ES_tradnl"/>
-        </w:rPr>
-      </w:pPr>
-      <w:r>
-        <w:rPr>
           <w:noProof/>
         </w:rPr>
         <w:drawing>
-          <wp:anchor distT="0" distB="0" distL="114300" distR="114300" simplePos="0" relativeHeight="251669504" behindDoc="1" locked="0" layoutInCell="1" allowOverlap="1" wp14:anchorId="1CF601B2" wp14:editId="5FA645D9">
+          <wp:anchor distT="0" distB="0" distL="114300" distR="114300" simplePos="0" relativeHeight="251669504" behindDoc="1" locked="0" layoutInCell="1" allowOverlap="1" wp14:anchorId="1CF601B2" wp14:editId="4DA4B485">
             <wp:simplePos x="0" y="0"/>
             <wp:positionH relativeFrom="margin">
               <wp:align>left</wp:align>
             </wp:positionH>
             <wp:positionV relativeFrom="paragraph">
-              <wp:posOffset>81915</wp:posOffset>
+              <wp:posOffset>144255</wp:posOffset>
             </wp:positionV>
             <wp:extent cx="913870" cy="1096645"/>
             <wp:effectExtent l="0" t="0" r="635" b="8255"/>
@@ -864,7 +806,7 @@
                     <pic:cNvPicPr/>
                   </pic:nvPicPr>
                   <pic:blipFill>
-                    <a:blip r:embed="rId13">
+                    <a:blip r:embed="rId12">
                       <a:extLst>
                         <a:ext uri="{28A0092B-C50C-407E-A947-70E740481C1C}">
                           <a14:useLocalDpi xmlns:a14="http://schemas.microsoft.com/office/drawing/2010/main" val="0"/>
@@ -896,13 +838,45 @@
           </wp:anchor>
         </w:drawing>
       </w:r>
+      <w:r>
+        <w:rPr>
+          <w:rFonts w:ascii="Arial" w:hAnsi="Arial" w:cs="Arial"/>
+          <w:bCs/>
+          <w:sz w:val="20"/>
+          <w:szCs w:val="20"/>
+          <w:lang w:val="es-ES_tradnl"/>
+        </w:rPr>
+        <w:t xml:space="preserve">Que, el numeral 2 del artículo 108° del Código Tributario, cuyo texto único ordenado fue aprobado por el Decreto Supremo </w:t>
+      </w:r>
+      <w:proofErr w:type="spellStart"/>
+      <w:r>
+        <w:rPr>
+          <w:rFonts w:ascii="Arial" w:hAnsi="Arial" w:cs="Arial"/>
+          <w:bCs/>
+          <w:sz w:val="20"/>
+          <w:szCs w:val="20"/>
+          <w:lang w:val="es-ES_tradnl"/>
+        </w:rPr>
+        <w:t>N.°</w:t>
+      </w:r>
+      <w:proofErr w:type="spellEnd"/>
+      <w:r>
+        <w:rPr>
+          <w:rFonts w:ascii="Arial" w:hAnsi="Arial" w:cs="Arial"/>
+          <w:bCs/>
+          <w:sz w:val="20"/>
+          <w:szCs w:val="20"/>
+          <w:lang w:val="es-ES_tradnl"/>
+        </w:rPr>
+        <w:t xml:space="preserve"> 133-2013-EF, establece que después de la notificación la Administración Tributaria sólo podrá revocar, modificar, sustituir o complementar sus actos, cuando detecte que se han presentado circunstancias posteriores a su emisión que demuestran su improcedencia o cuando se trate de errores materiales, tales como los de redacción o de cálculo.</w:t>
+      </w:r>
     </w:p>
     <w:p>
       <w:pPr>
         <w:tabs>
           <w:tab w:val="left" w:pos="10206"/>
         </w:tabs>
-        <w:spacing w:after="0" w:line="200" w:lineRule="atLeast"/>
+        <w:spacing w:after="0" w:line="0" w:lineRule="atLeast"/>
         <w:ind w:left="1418" w:right="1418"/>
         <w:jc w:val="both"/>
         <w:rPr>
@@ -913,23 +887,13 @@
           <w:lang w:val="es-ES_tradnl"/>
         </w:rPr>
       </w:pPr>
-      <w:r>
-        <w:rPr>
-          <w:rFonts w:ascii="Arial" w:hAnsi="Arial" w:cs="Arial"/>
-          <w:bCs/>
-          <w:sz w:val="20"/>
-          <w:szCs w:val="20"/>
-          <w:lang w:val="es-ES_tradnl"/>
-        </w:rPr>
-        <w:t>Que, el citado artículo añade que la Administración Tributaria señalará los casos en que existan circunstancias posteriores a la emisión de sus actos, así como errores materiales, y dictará el procedimiento para revocar, modificar, sustituir o complementar sus actos, según corresponda.</w:t>
-      </w:r>
     </w:p>
     <w:p>
       <w:pPr>
         <w:tabs>
           <w:tab w:val="left" w:pos="10206"/>
         </w:tabs>
-        <w:spacing w:after="0" w:line="200" w:lineRule="atLeast"/>
+        <w:spacing w:after="0" w:line="0" w:lineRule="atLeast"/>
         <w:ind w:left="1418" w:right="1418"/>
         <w:jc w:val="both"/>
         <w:rPr>
@@ -937,15 +901,26 @@
           <w:bCs/>
           <w:sz w:val="20"/>
           <w:szCs w:val="20"/>
-        </w:rPr>
-      </w:pPr>
+          <w:lang w:val="es-ES_tradnl"/>
+        </w:rPr>
+      </w:pPr>
+      <w:r>
+        <w:rPr>
+          <w:rFonts w:ascii="Arial" w:hAnsi="Arial" w:cs="Arial"/>
+          <w:bCs/>
+          <w:sz w:val="20"/>
+          <w:szCs w:val="20"/>
+          <w:lang w:val="es-ES_tradnl"/>
+        </w:rPr>
+        <w:t>Que, el citado artículo añade que la Administración Tributaria señalará los casos en que existan circunstancias posteriores a la emisión de sus actos, así como errores materiales, y dictará el procedimiento para revocar, modificar, sustituir o complementar sus actos, según corresponda.</w:t>
+      </w:r>
     </w:p>
     <w:p>
       <w:pPr>
         <w:tabs>
           <w:tab w:val="left" w:pos="10206"/>
         </w:tabs>
-        <w:spacing w:after="0" w:line="200" w:lineRule="atLeast"/>
+        <w:spacing w:after="0" w:line="0" w:lineRule="atLeast"/>
         <w:ind w:left="1418" w:right="1418"/>
         <w:jc w:val="both"/>
         <w:rPr>
@@ -953,26 +928,15 @@
           <w:bCs/>
           <w:sz w:val="20"/>
           <w:szCs w:val="20"/>
-          <w:lang w:val="es-ES_tradnl"/>
-        </w:rPr>
-      </w:pPr>
-      <w:r>
-        <w:rPr>
-          <w:rFonts w:ascii="Arial" w:hAnsi="Arial" w:cs="Arial"/>
-          <w:bCs/>
-          <w:sz w:val="20"/>
-          <w:szCs w:val="20"/>
-          <w:lang w:val="es-ES_tradnl"/>
-        </w:rPr>
-        <w:t>Que, mediante la Resolución de Superintendencia N.° 002-97/SUNAT y modificatorias, se establecen los supuestos en los cuales corresponde la aplicación de error material y se aprueba el Formulario N.° 194 “Comunicación para la revocación, modificación, sustitución, complementación o convalidación de los actos administrativos”, con la finalidad que los contribuyentes comuniquen la existencia de alguna de las causales detalladas en el artículo 1° de la misma resolución.</w:t>
-      </w:r>
+        </w:rPr>
+      </w:pPr>
     </w:p>
     <w:p>
       <w:pPr>
         <w:tabs>
           <w:tab w:val="left" w:pos="10206"/>
         </w:tabs>
-        <w:spacing w:after="0" w:line="200" w:lineRule="atLeast"/>
+        <w:spacing w:after="0" w:line="0" w:lineRule="atLeast"/>
         <w:ind w:left="1418" w:right="1418"/>
         <w:jc w:val="both"/>
         <w:rPr>
@@ -980,15 +944,86 @@
           <w:bCs/>
           <w:sz w:val="20"/>
           <w:szCs w:val="20"/>
-        </w:rPr>
-      </w:pPr>
+          <w:lang w:val="es-ES_tradnl"/>
+        </w:rPr>
+      </w:pPr>
+      <w:r>
+        <w:rPr>
+          <w:rFonts w:ascii="Arial" w:hAnsi="Arial" w:cs="Arial"/>
+          <w:bCs/>
+          <w:sz w:val="20"/>
+          <w:szCs w:val="20"/>
+          <w:lang w:val="es-ES_tradnl"/>
+        </w:rPr>
+        <w:t xml:space="preserve">Que, mediante la Resolución de Superintendencia </w:t>
+      </w:r>
+      <w:proofErr w:type="spellStart"/>
+      <w:r>
+        <w:rPr>
+          <w:rFonts w:ascii="Arial" w:hAnsi="Arial" w:cs="Arial"/>
+          <w:bCs/>
+          <w:sz w:val="20"/>
+          <w:szCs w:val="20"/>
+          <w:lang w:val="es-ES_tradnl"/>
+        </w:rPr>
+        <w:t>N.°</w:t>
+      </w:r>
+      <w:proofErr w:type="spellEnd"/>
+      <w:r>
+        <w:rPr>
+          <w:rFonts w:ascii="Arial" w:hAnsi="Arial" w:cs="Arial"/>
+          <w:bCs/>
+          <w:sz w:val="20"/>
+          <w:szCs w:val="20"/>
+          <w:lang w:val="es-ES_tradnl"/>
+        </w:rPr>
+        <w:t xml:space="preserve"> 002-97/SUNAT y modificatorias, se establecen los supuestos en los cuales corresponde la aplicación de error material y se aprueba el Formulario </w:t>
+      </w:r>
+      <w:proofErr w:type="spellStart"/>
+      <w:r>
+        <w:rPr>
+          <w:rFonts w:ascii="Arial" w:hAnsi="Arial" w:cs="Arial"/>
+          <w:bCs/>
+          <w:sz w:val="20"/>
+          <w:szCs w:val="20"/>
+          <w:lang w:val="es-ES_tradnl"/>
+        </w:rPr>
+        <w:t>N.°</w:t>
+      </w:r>
+      <w:proofErr w:type="spellEnd"/>
+      <w:r>
+        <w:rPr>
+          <w:rFonts w:ascii="Arial" w:hAnsi="Arial" w:cs="Arial"/>
+          <w:bCs/>
+          <w:sz w:val="20"/>
+          <w:szCs w:val="20"/>
+          <w:lang w:val="es-ES_tradnl"/>
+        </w:rPr>
+        <w:t xml:space="preserve"> 194 “Comunicación para la revocación, modificación, sustitución, complementación o convalidación de los actos administrativos”, con la finalidad que los contribuyentes comuniquen la existencia de alguna de las causales detalladas en el artículo 1° de la misma resolución.</w:t>
+      </w:r>
     </w:p>
     <w:p>
       <w:pPr>
         <w:tabs>
           <w:tab w:val="left" w:pos="10206"/>
         </w:tabs>
-        <w:spacing w:after="0" w:line="200" w:lineRule="atLeast"/>
+        <w:spacing w:after="0" w:line="0" w:lineRule="atLeast"/>
+        <w:ind w:left="1418" w:right="1418"/>
+        <w:jc w:val="both"/>
+        <w:rPr>
+          <w:rFonts w:ascii="Arial" w:hAnsi="Arial" w:cs="Arial"/>
+          <w:bCs/>
+          <w:sz w:val="20"/>
+          <w:szCs w:val="20"/>
+        </w:rPr>
+      </w:pPr>
+    </w:p>
+    <w:p>
+      <w:pPr>
+        <w:tabs>
+          <w:tab w:val="left" w:pos="10206"/>
+        </w:tabs>
+        <w:spacing w:after="0" w:line="0" w:lineRule="atLeast"/>
         <w:ind w:left="1418" w:right="1418"/>
         <w:jc w:val="both"/>
         <w:rPr>
@@ -1029,7 +1064,7 @@
                     </pic:cNvPicPr>
                   </pic:nvPicPr>
                   <pic:blipFill rotWithShape="1">
-                    <a:blip r:embed="rId14">
+                    <a:blip r:embed="rId13">
                       <a:extLst>
                         <a:ext uri="{28A0092B-C50C-407E-A947-70E740481C1C}">
                           <a14:useLocalDpi xmlns:a14="http://schemas.microsoft.com/office/drawing/2010/main" val="0"/>
@@ -1077,7 +1112,29 @@
           <w:szCs w:val="20"/>
           <w:lang w:val="es-ES_tradnl"/>
         </w:rPr>
-        <w:t>Que, el inciso i) del numeral 1 del artículo 1° de la Resolución de Superintendencia citada, indica que la SUNAT podrá revocar, modificar, sustituir o complementar las órdenes de pago, entre otras, con posterioridad a su notificación, cuando exista una declaración rectificatoria que hubiera determinado una obligación menor respecto a la deuda tributaria contenida en una orden de pago, siempre que la aludida declaración hubiera surtido efectos conforme a lo señalado en al artículo 88° del Código Tributario</w:t>
+        <w:t xml:space="preserve">Que, el inciso i) del numeral 1 del artículo 1° de la Resolución de Superintendencia citada, indica que la SUNAT podrá revocar, modificar, sustituir o complementar las órdenes de pago, entre otras, con posterioridad a su notificación, cuando exista una declaración </w:t>
+      </w:r>
+      <w:proofErr w:type="spellStart"/>
+      <w:r>
+        <w:rPr>
+          <w:rFonts w:ascii="Arial" w:hAnsi="Arial" w:cs="Arial"/>
+          <w:bCs/>
+          <w:sz w:val="20"/>
+          <w:szCs w:val="20"/>
+          <w:lang w:val="es-ES_tradnl"/>
+        </w:rPr>
+        <w:t>rectificatoria</w:t>
+      </w:r>
+      <w:proofErr w:type="spellEnd"/>
+      <w:r>
+        <w:rPr>
+          <w:rFonts w:ascii="Arial" w:hAnsi="Arial" w:cs="Arial"/>
+          <w:bCs/>
+          <w:sz w:val="20"/>
+          <w:szCs w:val="20"/>
+          <w:lang w:val="es-ES_tradnl"/>
+        </w:rPr>
+        <w:t xml:space="preserve"> que hubiera determinado una obligación menor respecto a la deuda tributaria contenida en una orden de pago, siempre que la aludida declaración hubiera surtido efectos conforme a lo señalado en al artículo 88° del Código Tributario</w:t>
       </w:r>
       <w:r>
         <w:rPr>
@@ -1095,7 +1152,7 @@
         <w:tabs>
           <w:tab w:val="left" w:pos="10206"/>
         </w:tabs>
-        <w:spacing w:after="0" w:line="200" w:lineRule="atLeast"/>
+        <w:spacing w:after="0" w:line="0" w:lineRule="atLeast"/>
         <w:ind w:left="1418" w:right="1418"/>
         <w:jc w:val="both"/>
         <w:rPr>
@@ -1111,7 +1168,7 @@
         <w:tabs>
           <w:tab w:val="left" w:pos="10206"/>
         </w:tabs>
-        <w:spacing w:after="0" w:line="200" w:lineRule="atLeast"/>
+        <w:spacing w:after="0" w:line="0" w:lineRule="atLeast"/>
         <w:ind w:left="1418" w:right="1418"/>
         <w:jc w:val="both"/>
         <w:rPr>
@@ -1167,7 +1224,7 @@
         <w:tabs>
           <w:tab w:val="left" w:pos="10206"/>
         </w:tabs>
-        <w:spacing w:after="0"/>
+        <w:spacing w:after="0" w:line="0" w:lineRule="atLeast"/>
         <w:ind w:left="1418" w:right="1416"/>
         <w:jc w:val="both"/>
         <w:rPr>
@@ -1468,6 +1525,7 @@
                 <w:rFonts w:ascii="Arial" w:eastAsia="Times New Roman" w:hAnsi="Arial" w:cs="Arial"/>
                 <w:sz w:val="16"/>
                 <w:szCs w:val="16"/>
+                <w:highlight w:val="yellow"/>
                 <w:lang w:eastAsia="es-PE"/>
               </w:rPr>
             </w:pPr>
@@ -1506,6 +1564,7 @@
                 <w:rFonts w:ascii="Arial" w:eastAsia="Times New Roman" w:hAnsi="Arial" w:cs="Arial"/>
                 <w:sz w:val="20"/>
                 <w:szCs w:val="20"/>
+                <w:highlight w:val="yellow"/>
                 <w:lang w:eastAsia="es-PE"/>
               </w:rPr>
             </w:pPr>
@@ -1542,6 +1601,7 @@
                 <w:rFonts w:ascii="Arial" w:eastAsia="Times New Roman" w:hAnsi="Arial" w:cs="Arial"/>
                 <w:sz w:val="20"/>
                 <w:szCs w:val="20"/>
+                <w:highlight w:val="yellow"/>
                 <w:lang w:eastAsia="es-PE"/>
               </w:rPr>
             </w:pPr>
@@ -1578,6 +1638,7 @@
                 <w:rFonts w:ascii="Arial" w:eastAsia="Times New Roman" w:hAnsi="Arial" w:cs="Arial"/>
                 <w:sz w:val="20"/>
                 <w:szCs w:val="20"/>
+                <w:highlight w:val="yellow"/>
                 <w:lang w:eastAsia="es-PE"/>
               </w:rPr>
             </w:pPr>
@@ -1614,6 +1675,7 @@
                 <w:rFonts w:ascii="Arial" w:eastAsia="Times New Roman" w:hAnsi="Arial" w:cs="Arial"/>
                 <w:sz w:val="20"/>
                 <w:szCs w:val="20"/>
+                <w:highlight w:val="yellow"/>
                 <w:lang w:eastAsia="es-PE"/>
               </w:rPr>
             </w:pPr>
@@ -1650,6 +1712,7 @@
                 <w:rFonts w:ascii="Arial" w:eastAsia="Times New Roman" w:hAnsi="Arial" w:cs="Arial"/>
                 <w:sz w:val="20"/>
                 <w:szCs w:val="20"/>
+                <w:highlight w:val="yellow"/>
                 <w:lang w:eastAsia="es-PE"/>
               </w:rPr>
             </w:pPr>
@@ -1660,25 +1723,7 @@
                 <w:szCs w:val="20"/>
                 <w:lang w:eastAsia="es-PE"/>
               </w:rPr>
-              <w:t>{{</w:t>
-            </w:r>
-            <w:r>
-              <w:rPr>
-                <w:rFonts w:ascii="Arial" w:eastAsia="Times New Roman" w:hAnsi="Arial" w:cs="Arial"/>
-                <w:sz w:val="20"/>
-                <w:szCs w:val="20"/>
-                <w:lang w:eastAsia="es-PE"/>
-              </w:rPr>
-              <w:t>TOTAL</w:t>
-            </w:r>
-            <w:r>
-              <w:rPr>
-                <w:rFonts w:ascii="Arial" w:eastAsia="Times New Roman" w:hAnsi="Arial" w:cs="Arial"/>
-                <w:sz w:val="20"/>
-                <w:szCs w:val="20"/>
-                <w:lang w:eastAsia="es-PE"/>
-              </w:rPr>
-              <w:t>}}</w:t>
+              <w:t>{{TOTAL}}</w:t>
             </w:r>
           </w:p>
         </w:tc>
@@ -1686,119 +1731,199 @@
     </w:tbl>
     <w:p>
       <w:pPr>
-        <w:spacing w:after="0"/>
-        <w:ind w:left="1418" w:right="1416"/>
+        <w:spacing w:after="0" w:line="0" w:lineRule="atLeast"/>
+        <w:ind w:left="1418" w:right="1418"/>
         <w:jc w:val="both"/>
         <w:rPr>
           <w:rFonts w:ascii="Arial" w:hAnsi="Arial" w:cs="Arial"/>
           <w:bCs/>
           <w:sz w:val="20"/>
           <w:szCs w:val="20"/>
-          <w:lang w:val="es-ES_tradnl"/>
-        </w:rPr>
-      </w:pPr>
+          <w:lang w:val="es-ES"/>
+        </w:rPr>
+      </w:pPr>
+      <w:bookmarkStart w:id="1" w:name="_Hlk139618958"/>
+      <w:r>
+        <w:rPr>
+          <w:rFonts w:ascii="Arial" w:hAnsi="Arial" w:cs="Arial"/>
+          <w:bCs/>
+          <w:sz w:val="20"/>
+          <w:szCs w:val="20"/>
+          <w:lang w:val="es-ES_tradnl"/>
+        </w:rPr>
+        <w:t>Que, la emisión de la orden de pago descrita se sustenta en la declaración jurada presentada por el contribuyente el</w:t>
+      </w:r>
+      <w:r>
+        <w:rPr>
+          <w:rFonts w:ascii="Arial" w:hAnsi="Arial" w:cs="Arial"/>
+          <w:bCs/>
+          <w:sz w:val="20"/>
+          <w:szCs w:val="20"/>
+          <w:lang w:val="es-ES_tradnl"/>
+        </w:rPr>
+        <w:t xml:space="preserve"> </w:t>
+      </w:r>
+      <w:r>
+        <w:rPr>
+          <w:rFonts w:ascii="Arial" w:hAnsi="Arial" w:cs="Arial"/>
+          <w:bCs/>
+          <w:sz w:val="20"/>
+          <w:szCs w:val="20"/>
+          <w:lang w:val="es-ES_tradnl"/>
+        </w:rPr>
+        <w:t>22/01/2026</w:t>
+      </w:r>
+      <w:r>
+        <w:rPr>
+          <w:rFonts w:ascii="Arial" w:hAnsi="Arial" w:cs="Arial"/>
+          <w:bCs/>
+          <w:sz w:val="20"/>
+          <w:szCs w:val="20"/>
+          <w:lang w:val="es-ES_tradnl"/>
+        </w:rPr>
+        <w:t>, mediante el Formulario PDT</w:t>
+      </w:r>
+      <w:r>
+        <w:rPr>
+          <w:rFonts w:ascii="Arial" w:hAnsi="Arial" w:cs="Arial"/>
+          <w:bCs/>
+          <w:sz w:val="20"/>
+          <w:szCs w:val="20"/>
+          <w:lang w:val="es-ES_tradnl"/>
+        </w:rPr>
+        <w:t xml:space="preserve"> </w:t>
+      </w:r>
+      <w:r>
+        <w:rPr>
+          <w:rFonts w:ascii="Arial" w:hAnsi="Arial" w:cs="Arial"/>
+          <w:bCs/>
+          <w:sz w:val="20"/>
+          <w:szCs w:val="20"/>
+          <w:lang w:val="es-ES_tradnl"/>
+        </w:rPr>
+        <w:t>{{</w:t>
+      </w:r>
+      <w:r>
+        <w:rPr>
+          <w:rFonts w:ascii="Arial" w:hAnsi="Arial" w:cs="Arial"/>
+          <w:bCs/>
+          <w:sz w:val="20"/>
+          <w:szCs w:val="20"/>
+          <w:lang w:val="es-ES_tradnl"/>
+        </w:rPr>
+        <w:t>PDT</w:t>
+      </w:r>
+      <w:r>
+        <w:rPr>
+          <w:rFonts w:ascii="Arial" w:hAnsi="Arial" w:cs="Arial"/>
+          <w:bCs/>
+          <w:sz w:val="20"/>
+          <w:szCs w:val="20"/>
+          <w:lang w:val="es-ES_tradnl"/>
+        </w:rPr>
+        <w:t>}}</w:t>
+      </w:r>
+      <w:r>
+        <w:rPr>
+          <w:rFonts w:ascii="Arial" w:hAnsi="Arial" w:cs="Arial"/>
+          <w:bCs/>
+          <w:sz w:val="20"/>
+          <w:szCs w:val="20"/>
+          <w:lang w:val="es-ES_tradnl"/>
+        </w:rPr>
+        <w:t xml:space="preserve"> con N.º de Orden </w:t>
+      </w:r>
+      <w:bookmarkEnd w:id="1"/>
+      <w:r>
+        <w:rPr>
+          <w:rFonts w:ascii="Arial" w:hAnsi="Arial" w:cs="Arial"/>
+          <w:bCs/>
+          <w:sz w:val="20"/>
+          <w:szCs w:val="20"/>
+          <w:lang w:val="es-ES_tradnl"/>
+        </w:rPr>
+        <w:t>{{NRO_O</w:t>
+      </w:r>
+      <w:r>
+        <w:rPr>
+          <w:rFonts w:ascii="Arial" w:hAnsi="Arial" w:cs="Arial"/>
+          <w:bCs/>
+          <w:sz w:val="20"/>
+          <w:szCs w:val="20"/>
+          <w:lang w:val="es-ES_tradnl"/>
+        </w:rPr>
+        <w:t>D</w:t>
+      </w:r>
+      <w:r>
+        <w:rPr>
+          <w:rFonts w:ascii="Arial" w:hAnsi="Arial" w:cs="Arial"/>
+          <w:bCs/>
+          <w:sz w:val="20"/>
+          <w:szCs w:val="20"/>
+          <w:lang w:val="es-ES_tradnl"/>
+        </w:rPr>
+        <w:t>}}</w:t>
+      </w:r>
+      <w:r>
+        <w:rPr>
+          <w:rFonts w:ascii="Arial" w:hAnsi="Arial" w:cs="Arial"/>
+          <w:bCs/>
+          <w:sz w:val="20"/>
+          <w:szCs w:val="20"/>
+          <w:lang w:val="es-ES_tradnl"/>
+        </w:rPr>
+        <w:t xml:space="preserve"> </w:t>
+      </w:r>
+      <w:r>
+        <w:rPr>
+          <w:rFonts w:ascii="Arial" w:hAnsi="Arial" w:cs="Arial"/>
+          <w:bCs/>
+          <w:sz w:val="20"/>
+          <w:szCs w:val="20"/>
+          <w:lang w:val="es-ES_tradnl"/>
+        </w:rPr>
+        <w:t xml:space="preserve">en la </w:t>
+      </w:r>
+      <w:r>
+        <w:rPr>
+          <w:rFonts w:ascii="Arial" w:hAnsi="Arial" w:cs="Arial"/>
+          <w:bCs/>
+          <w:sz w:val="20"/>
+          <w:szCs w:val="20"/>
+          <w:lang w:val="es-ES_tradnl"/>
+        </w:rPr>
+        <w:lastRenderedPageBreak/>
+        <w:t>que determina como deuda tributaria por el tributo y periodo señalados, el monto de</w:t>
+      </w:r>
+      <w:r>
+        <w:rPr>
+          <w:rFonts w:ascii="Arial" w:hAnsi="Arial" w:cs="Arial"/>
+          <w:bCs/>
+          <w:sz w:val="20"/>
+          <w:szCs w:val="20"/>
+          <w:lang w:val="es-ES_tradnl"/>
+        </w:rPr>
+        <w:t>scrito en el cuadro precedente.</w:t>
+      </w:r>
     </w:p>
     <w:p>
       <w:pPr>
-        <w:spacing w:after="0" w:line="200" w:lineRule="atLeast"/>
-        <w:ind w:left="1418" w:right="1416"/>
+        <w:spacing w:after="0" w:line="0" w:lineRule="atLeast"/>
+        <w:ind w:left="1418" w:right="1418"/>
         <w:jc w:val="both"/>
         <w:rPr>
           <w:rFonts w:ascii="Arial" w:hAnsi="Arial" w:cs="Arial"/>
           <w:bCs/>
           <w:sz w:val="20"/>
           <w:szCs w:val="20"/>
-          <w:lang w:val="es-ES"/>
-        </w:rPr>
-      </w:pPr>
-      <w:bookmarkStart w:id="1" w:name="_Hlk139618958"/>
-      <w:r>
-        <w:rPr>
-          <w:rFonts w:ascii="Arial" w:hAnsi="Arial" w:cs="Arial"/>
-          <w:bCs/>
-          <w:sz w:val="20"/>
-          <w:szCs w:val="20"/>
-          <w:lang w:val="es-ES_tradnl"/>
-        </w:rPr>
-        <w:lastRenderedPageBreak/>
-        <w:t>Que, la emisión de la orden de pago descrita se sustenta en la declaración jurada presentada por el contribuyente el</w:t>
-      </w:r>
-      <w:r>
-        <w:rPr>
-          <w:rFonts w:ascii="Arial" w:hAnsi="Arial" w:cs="Arial"/>
-          <w:bCs/>
-          <w:sz w:val="20"/>
-          <w:szCs w:val="20"/>
-          <w:lang w:val="es-ES_tradnl"/>
-        </w:rPr>
-        <w:t xml:space="preserve"> </w:t>
-      </w:r>
-      <w:r>
-        <w:rPr>
-          <w:rFonts w:ascii="Arial" w:hAnsi="Arial" w:cs="Arial"/>
-          <w:bCs/>
-          <w:sz w:val="20"/>
-          <w:szCs w:val="20"/>
-          <w:lang w:val="es-ES_tradnl"/>
-        </w:rPr>
-        <w:t>{{FEC_DEC}}</w:t>
-      </w:r>
-      <w:r>
-        <w:rPr>
-          <w:rFonts w:ascii="Arial" w:hAnsi="Arial" w:cs="Arial"/>
-          <w:bCs/>
-          <w:sz w:val="20"/>
-          <w:szCs w:val="20"/>
-          <w:lang w:val="es-ES_tradnl"/>
-        </w:rPr>
-        <w:t xml:space="preserve">, mediante el Formulario PDT 0621 con N.º de Orden </w:t>
-      </w:r>
-      <w:bookmarkEnd w:id="1"/>
-      <w:r>
-        <w:rPr>
-          <w:rFonts w:ascii="Arial" w:hAnsi="Arial" w:cs="Arial"/>
-          <w:bCs/>
-          <w:sz w:val="20"/>
-          <w:szCs w:val="20"/>
-          <w:lang w:val="es-ES_tradnl"/>
-        </w:rPr>
-        <w:t>{{NRO_OD}}</w:t>
-      </w:r>
-      <w:r>
-        <w:rPr>
-          <w:rFonts w:ascii="Arial" w:hAnsi="Arial" w:cs="Arial"/>
-          <w:bCs/>
-          <w:sz w:val="20"/>
-          <w:szCs w:val="20"/>
-          <w:lang w:val="es-ES_tradnl"/>
-        </w:rPr>
-        <w:t xml:space="preserve"> </w:t>
-      </w:r>
-      <w:r>
-        <w:rPr>
-          <w:rFonts w:ascii="Arial" w:hAnsi="Arial" w:cs="Arial"/>
-          <w:bCs/>
-          <w:sz w:val="20"/>
-          <w:szCs w:val="20"/>
-          <w:lang w:val="es-ES_tradnl"/>
-        </w:rPr>
-        <w:t>en la que determina como deuda tributaria por el tributo y periodo señalados, el monto de</w:t>
-      </w:r>
-      <w:r>
-        <w:rPr>
-          <w:rFonts w:ascii="Arial" w:hAnsi="Arial" w:cs="Arial"/>
-          <w:bCs/>
-          <w:sz w:val="20"/>
-          <w:szCs w:val="20"/>
-          <w:lang w:val="es-ES_tradnl"/>
-        </w:rPr>
-        <w:t>scrito en el cuadro precedente.</w:t>
-      </w:r>
+          <w:lang w:val="es-ES_tradnl"/>
+        </w:rPr>
+      </w:pPr>
     </w:p>
     <w:p>
       <w:pPr>
-        <w:spacing w:after="0" w:line="200" w:lineRule="atLeast"/>
-        <w:ind w:left="1418" w:right="1416"/>
+        <w:spacing w:after="0" w:line="0" w:lineRule="atLeast"/>
+        <w:ind w:left="1418" w:right="1418"/>
         <w:jc w:val="both"/>
         <w:rPr>
           <w:rFonts w:ascii="Arial" w:hAnsi="Arial" w:cs="Arial"/>
@@ -1808,11 +1933,83 @@
           <w:lang w:val="es-ES_tradnl"/>
         </w:rPr>
       </w:pPr>
+      <w:r>
+        <w:rPr>
+          <w:rFonts w:ascii="Arial" w:hAnsi="Arial" w:cs="Arial"/>
+          <w:bCs/>
+          <w:sz w:val="20"/>
+          <w:szCs w:val="20"/>
+          <w:lang w:val="es-ES_tradnl"/>
+        </w:rPr>
+        <w:t xml:space="preserve">Que, el contribuyente con fecha </w:t>
+      </w:r>
+      <w:r>
+        <w:rPr>
+          <w:rFonts w:ascii="Arial" w:hAnsi="Arial" w:cs="Arial"/>
+          <w:bCs/>
+          <w:sz w:val="20"/>
+          <w:szCs w:val="20"/>
+          <w:lang w:val="es-ES_tradnl"/>
+        </w:rPr>
+        <w:t xml:space="preserve">19/02/2026 </w:t>
+      </w:r>
+      <w:r>
+        <w:rPr>
+          <w:rFonts w:ascii="Arial" w:hAnsi="Arial" w:cs="Arial"/>
+          <w:bCs/>
+          <w:sz w:val="20"/>
+          <w:szCs w:val="20"/>
+          <w:lang w:val="es-ES_tradnl"/>
+        </w:rPr>
+        <w:t xml:space="preserve">presenta una declaración </w:t>
+      </w:r>
+      <w:proofErr w:type="spellStart"/>
+      <w:r>
+        <w:rPr>
+          <w:rFonts w:ascii="Arial" w:hAnsi="Arial" w:cs="Arial"/>
+          <w:bCs/>
+          <w:sz w:val="20"/>
+          <w:szCs w:val="20"/>
+          <w:lang w:val="es-ES_tradnl"/>
+        </w:rPr>
+        <w:t>rectificatoria</w:t>
+      </w:r>
+      <w:proofErr w:type="spellEnd"/>
+      <w:r>
+        <w:rPr>
+          <w:rFonts w:ascii="Arial" w:hAnsi="Arial" w:cs="Arial"/>
+          <w:bCs/>
+          <w:sz w:val="20"/>
+          <w:szCs w:val="20"/>
+          <w:lang w:val="es-ES_tradnl"/>
+        </w:rPr>
+        <w:t xml:space="preserve"> mediante el Formulario PDT 0621 con N.º de Orden </w:t>
+      </w:r>
+      <w:r>
+        <w:rPr>
+          <w:rFonts w:ascii="Arial" w:hAnsi="Arial" w:cs="Arial"/>
+          <w:bCs/>
+          <w:sz w:val="20"/>
+          <w:szCs w:val="20"/>
+          <w:lang w:val="es-ES_tradnl"/>
+        </w:rPr>
+        <w:t xml:space="preserve">1174318033 </w:t>
+      </w:r>
+      <w:r>
+        <w:rPr>
+          <w:rFonts w:ascii="Arial" w:hAnsi="Arial" w:cs="Arial"/>
+          <w:bCs/>
+          <w:sz w:val="20"/>
+          <w:szCs w:val="20"/>
+          <w:lang w:val="es-ES_tradnl"/>
+        </w:rPr>
+        <w:t>en la que determina menor obligación por el tributo y periodo materia de la presente resolución.</w:t>
+      </w:r>
     </w:p>
     <w:p>
       <w:pPr>
-        <w:spacing w:after="0" w:line="200" w:lineRule="atLeast"/>
-        <w:ind w:left="1418" w:right="1416"/>
+        <w:spacing w:after="0" w:line="0" w:lineRule="atLeast"/>
+        <w:ind w:left="1418" w:right="1418"/>
         <w:jc w:val="both"/>
         <w:rPr>
           <w:rFonts w:ascii="Arial" w:hAnsi="Arial" w:cs="Arial"/>
@@ -1822,125 +2019,11 @@
           <w:lang w:val="es-ES_tradnl"/>
         </w:rPr>
       </w:pPr>
-      <w:r>
-        <w:rPr>
-          <w:rFonts w:ascii="Arial" w:hAnsi="Arial" w:cs="Arial"/>
-          <w:bCs/>
-          <w:sz w:val="20"/>
-          <w:szCs w:val="20"/>
-          <w:lang w:val="es-ES_tradnl"/>
-        </w:rPr>
-        <w:t xml:space="preserve">Que, el contribuyente con fecha </w:t>
-      </w:r>
-      <w:r>
-        <w:rPr>
-          <w:rFonts w:ascii="Arial" w:hAnsi="Arial" w:cs="Arial"/>
-          <w:bCs/>
-          <w:sz w:val="20"/>
-          <w:szCs w:val="20"/>
-          <w:lang w:val="es-ES_tradnl"/>
-        </w:rPr>
-        <w:t>{{FECHA_RECTI}}</w:t>
-      </w:r>
-      <w:r>
-        <w:rPr>
-          <w:rFonts w:ascii="Arial" w:hAnsi="Arial" w:cs="Arial"/>
-          <w:bCs/>
-          <w:sz w:val="20"/>
-          <w:szCs w:val="20"/>
-          <w:lang w:val="es-ES_tradnl"/>
-        </w:rPr>
-        <w:t xml:space="preserve"> </w:t>
-      </w:r>
-      <w:r>
-        <w:rPr>
-          <w:rFonts w:ascii="Arial" w:hAnsi="Arial" w:cs="Arial"/>
-          <w:bCs/>
-          <w:sz w:val="20"/>
-          <w:szCs w:val="20"/>
-          <w:lang w:val="es-ES_tradnl"/>
-        </w:rPr>
-        <w:t xml:space="preserve">presenta una declaración </w:t>
-      </w:r>
-      <w:proofErr w:type="spellStart"/>
-      <w:r>
-        <w:rPr>
-          <w:rFonts w:ascii="Arial" w:hAnsi="Arial" w:cs="Arial"/>
-          <w:bCs/>
-          <w:sz w:val="20"/>
-          <w:szCs w:val="20"/>
-          <w:lang w:val="es-ES_tradnl"/>
-        </w:rPr>
-        <w:t>rectificatoria</w:t>
-      </w:r>
-      <w:proofErr w:type="spellEnd"/>
-      <w:r>
-        <w:rPr>
-          <w:rFonts w:ascii="Arial" w:hAnsi="Arial" w:cs="Arial"/>
-          <w:bCs/>
-          <w:sz w:val="20"/>
-          <w:szCs w:val="20"/>
-          <w:lang w:val="es-ES_tradnl"/>
-        </w:rPr>
-        <w:t xml:space="preserve"> mediante el Formulario PDT 0621 con N.º de Orden </w:t>
-      </w:r>
-      <w:r>
-        <w:rPr>
-          <w:rFonts w:ascii="Arial" w:hAnsi="Arial" w:cs="Arial"/>
-          <w:bCs/>
-          <w:sz w:val="20"/>
-          <w:szCs w:val="20"/>
-          <w:lang w:val="es-ES_tradnl"/>
-        </w:rPr>
-        <w:t>{{NRO_OD_MOD</w:t>
-      </w:r>
-      <w:proofErr w:type="gramStart"/>
-      <w:r>
-        <w:rPr>
-          <w:rFonts w:ascii="Arial" w:hAnsi="Arial" w:cs="Arial"/>
-          <w:bCs/>
-          <w:sz w:val="20"/>
-          <w:szCs w:val="20"/>
-          <w:lang w:val="es-ES_tradnl"/>
-        </w:rPr>
-        <w:t xml:space="preserve">}} </w:t>
-      </w:r>
-      <w:r>
-        <w:rPr>
-          <w:rFonts w:ascii="Arial" w:hAnsi="Arial" w:cs="Arial"/>
-          <w:bCs/>
-          <w:sz w:val="20"/>
-          <w:szCs w:val="20"/>
-          <w:lang w:val="es-ES_tradnl"/>
-        </w:rPr>
-        <w:t xml:space="preserve"> </w:t>
-      </w:r>
-      <w:r>
-        <w:rPr>
-          <w:rFonts w:ascii="Arial" w:hAnsi="Arial" w:cs="Arial"/>
-          <w:bCs/>
-          <w:sz w:val="20"/>
-          <w:szCs w:val="20"/>
-          <w:lang w:val="es-ES_tradnl"/>
-        </w:rPr>
-        <w:t>en</w:t>
-      </w:r>
-      <w:proofErr w:type="gramEnd"/>
-      <w:r>
-        <w:rPr>
-          <w:rFonts w:ascii="Arial" w:hAnsi="Arial" w:cs="Arial"/>
-          <w:bCs/>
-          <w:sz w:val="20"/>
-          <w:szCs w:val="20"/>
-          <w:lang w:val="es-ES_tradnl"/>
-        </w:rPr>
-        <w:t xml:space="preserve"> la que determina menor obligación por el tributo y periodo materia de la presente resolución.</w:t>
-      </w:r>
     </w:p>
     <w:p>
       <w:pPr>
-        <w:spacing w:after="0" w:line="200" w:lineRule="atLeast"/>
-        <w:ind w:left="1418" w:right="1416"/>
+        <w:spacing w:after="0" w:line="0" w:lineRule="atLeast"/>
+        <w:ind w:left="1418" w:right="1418"/>
         <w:jc w:val="both"/>
         <w:rPr>
           <w:rFonts w:ascii="Arial" w:hAnsi="Arial" w:cs="Arial"/>
@@ -1950,11 +2033,43 @@
           <w:lang w:val="es-ES_tradnl"/>
         </w:rPr>
       </w:pPr>
+      <w:r>
+        <w:rPr>
+          <w:rFonts w:ascii="Arial" w:hAnsi="Arial" w:cs="Arial"/>
+          <w:bCs/>
+          <w:sz w:val="20"/>
+          <w:szCs w:val="20"/>
+          <w:lang w:val="es-ES_tradnl"/>
+        </w:rPr>
+        <w:t xml:space="preserve">Que, según lo establecido en el cuarto párrafo del numeral 88.2 del artículo 88° del Código Tributario, la declaración </w:t>
+      </w:r>
+      <w:proofErr w:type="spellStart"/>
+      <w:r>
+        <w:rPr>
+          <w:rFonts w:ascii="Arial" w:hAnsi="Arial" w:cs="Arial"/>
+          <w:bCs/>
+          <w:sz w:val="20"/>
+          <w:szCs w:val="20"/>
+          <w:lang w:val="es-ES_tradnl"/>
+        </w:rPr>
+        <w:t>rectificatoria</w:t>
+      </w:r>
+      <w:proofErr w:type="spellEnd"/>
+      <w:r>
+        <w:rPr>
+          <w:rFonts w:ascii="Arial" w:hAnsi="Arial" w:cs="Arial"/>
+          <w:bCs/>
+          <w:sz w:val="20"/>
+          <w:szCs w:val="20"/>
+          <w:lang w:val="es-ES_tradnl"/>
+        </w:rPr>
+        <w:t xml:space="preserve"> surtirá efecto con su presentación siempre que determine igual o mayor obligación. En caso contrario, surtirá efectos si dentro de un plazo de cuarenta y cinco (45) días hábiles siguientes a su presentación la Administración Tributaria no emitiera pronunciamiento sobre la veracidad y exactitud de los datos contenidos en ella, sin perjuicio de la facultad de la Administración Tributaria de efectuar la verificación o fiscalización posterior.</w:t>
+      </w:r>
     </w:p>
     <w:p>
       <w:pPr>
-        <w:spacing w:after="0" w:line="200" w:lineRule="atLeast"/>
-        <w:ind w:left="1418" w:right="1416"/>
+        <w:spacing w:after="0" w:line="0" w:lineRule="atLeast"/>
+        <w:ind w:left="1418" w:right="1418"/>
         <w:jc w:val="both"/>
         <w:rPr>
           <w:rFonts w:ascii="Arial" w:hAnsi="Arial" w:cs="Arial"/>
@@ -1964,81 +2079,11 @@
           <w:lang w:val="es-ES_tradnl"/>
         </w:rPr>
       </w:pPr>
-      <w:r>
-        <w:rPr>
-          <w:noProof/>
-        </w:rPr>
-        <w:drawing>
-          <wp:anchor distT="0" distB="0" distL="114300" distR="114300" simplePos="0" relativeHeight="251671552" behindDoc="1" locked="0" layoutInCell="1" allowOverlap="1" wp14:anchorId="56B27C9E" wp14:editId="2F28BA58">
-            <wp:simplePos x="0" y="0"/>
-            <wp:positionH relativeFrom="margin">
-              <wp:align>left</wp:align>
-            </wp:positionH>
-            <wp:positionV relativeFrom="paragraph">
-              <wp:posOffset>211455</wp:posOffset>
-            </wp:positionV>
-            <wp:extent cx="913870" cy="1096645"/>
-            <wp:effectExtent l="0" t="0" r="635" b="8255"/>
-            <wp:wrapNone/>
-            <wp:docPr id="9" name="Imagen 9" descr="Imagen que contiene Gráfico&#10;&#10;Descripción generada automáticamente"/>
-            <wp:cNvGraphicFramePr>
-              <a:graphicFrameLocks xmlns:a="http://schemas.openxmlformats.org/drawingml/2006/main" noChangeAspect="1"/>
-            </wp:cNvGraphicFramePr>
-            <a:graphic xmlns:a="http://schemas.openxmlformats.org/drawingml/2006/main">
-              <a:graphicData uri="http://schemas.openxmlformats.org/drawingml/2006/picture">
-                <pic:pic xmlns:pic="http://schemas.openxmlformats.org/drawingml/2006/picture">
-                  <pic:nvPicPr>
-                    <pic:cNvPr id="20" name="Imagen 20" descr="Imagen que contiene Gráfico&#10;&#10;Descripción generada automáticamente"/>
-                    <pic:cNvPicPr/>
-                  </pic:nvPicPr>
-                  <pic:blipFill>
-                    <a:blip r:embed="rId13">
-                      <a:extLst>
-                        <a:ext uri="{28A0092B-C50C-407E-A947-70E740481C1C}">
-                          <a14:useLocalDpi xmlns:a14="http://schemas.microsoft.com/office/drawing/2010/main" val="0"/>
-                        </a:ext>
-                      </a:extLst>
-                    </a:blip>
-                    <a:stretch>
-                      <a:fillRect/>
-                    </a:stretch>
-                  </pic:blipFill>
-                  <pic:spPr>
-                    <a:xfrm>
-                      <a:off x="0" y="0"/>
-                      <a:ext cx="913870" cy="1096645"/>
-                    </a:xfrm>
-                    <a:prstGeom prst="rect">
-                      <a:avLst/>
-                    </a:prstGeom>
-                  </pic:spPr>
-                </pic:pic>
-              </a:graphicData>
-            </a:graphic>
-            <wp14:sizeRelH relativeFrom="margin">
-              <wp14:pctWidth>0</wp14:pctWidth>
-            </wp14:sizeRelH>
-            <wp14:sizeRelV relativeFrom="margin">
-              <wp14:pctHeight>0</wp14:pctHeight>
-            </wp14:sizeRelV>
-          </wp:anchor>
-        </w:drawing>
-      </w:r>
-      <w:r>
-        <w:rPr>
-          <w:rFonts w:ascii="Arial" w:hAnsi="Arial" w:cs="Arial"/>
-          <w:bCs/>
-          <w:sz w:val="20"/>
-          <w:szCs w:val="20"/>
-          <w:lang w:val="es-ES_tradnl"/>
-        </w:rPr>
-        <w:t>Que, según lo establecido en el cuarto párrafo del numeral 88.2 del artículo 88° del Código Tributario, la declaración rectificatoria surtirá efecto con su presentación siempre que determine igual o mayor obligación. En caso contrario, surtirá efectos si dentro de un plazo de cuarenta y cinco (45) días hábiles siguientes a su presentación la Administración Tributaria no emitiera pronunciamiento sobre la veracidad y exactitud de los datos contenidos en ella, sin perjuicio de la facultad de la Administración Tributaria de efectuar la verificación o fiscalización posterior.</w:t>
-      </w:r>
     </w:p>
     <w:p>
       <w:pPr>
-        <w:spacing w:after="0" w:line="200" w:lineRule="atLeast"/>
-        <w:ind w:left="1418" w:right="1416"/>
+        <w:spacing w:after="0" w:line="0" w:lineRule="atLeast"/>
+        <w:ind w:left="1418" w:right="1418"/>
         <w:jc w:val="both"/>
         <w:rPr>
           <w:rFonts w:ascii="Arial" w:hAnsi="Arial" w:cs="Arial"/>
@@ -2048,11 +2093,86 @@
           <w:lang w:val="es-ES_tradnl"/>
         </w:rPr>
       </w:pPr>
+      <w:r>
+        <w:rPr>
+          <w:rFonts w:ascii="Arial" w:hAnsi="Arial" w:cs="Arial"/>
+          <w:bCs/>
+          <w:sz w:val="20"/>
+          <w:szCs w:val="20"/>
+          <w:lang w:val="es-ES_tradnl"/>
+        </w:rPr>
+        <w:t xml:space="preserve">Que, la declaración </w:t>
+      </w:r>
+      <w:proofErr w:type="spellStart"/>
+      <w:r>
+        <w:rPr>
+          <w:rFonts w:ascii="Arial" w:hAnsi="Arial" w:cs="Arial"/>
+          <w:bCs/>
+          <w:sz w:val="20"/>
+          <w:szCs w:val="20"/>
+          <w:lang w:val="es-ES_tradnl"/>
+        </w:rPr>
+        <w:t>rectificatoria</w:t>
+      </w:r>
+      <w:proofErr w:type="spellEnd"/>
+      <w:r>
+        <w:rPr>
+          <w:rFonts w:ascii="Arial" w:hAnsi="Arial" w:cs="Arial"/>
+          <w:bCs/>
+          <w:sz w:val="20"/>
+          <w:szCs w:val="20"/>
+          <w:lang w:val="es-ES_tradnl"/>
+        </w:rPr>
+        <w:t xml:space="preserve"> presentada por el contribuyente ha surtido sus efectos (únicamente en mérito a la norma descrita, siendo necesario indicar que no se ha validado la información consignada en la declaración </w:t>
+      </w:r>
+      <w:proofErr w:type="spellStart"/>
+      <w:r>
+        <w:rPr>
+          <w:rFonts w:ascii="Arial" w:hAnsi="Arial" w:cs="Arial"/>
+          <w:bCs/>
+          <w:sz w:val="20"/>
+          <w:szCs w:val="20"/>
+          <w:lang w:val="es-ES_tradnl"/>
+        </w:rPr>
+        <w:t>rectificatoria</w:t>
+      </w:r>
+      <w:proofErr w:type="spellEnd"/>
+      <w:r>
+        <w:rPr>
+          <w:rFonts w:ascii="Arial" w:hAnsi="Arial" w:cs="Arial"/>
+          <w:bCs/>
+          <w:sz w:val="20"/>
+          <w:szCs w:val="20"/>
+          <w:lang w:val="es-ES_tradnl"/>
+        </w:rPr>
+        <w:t xml:space="preserve">), por lo que corresponde </w:t>
+      </w:r>
+      <w:r>
+        <w:rPr>
+          <w:rFonts w:ascii="Arial" w:hAnsi="Arial" w:cs="Arial"/>
+          <w:b/>
+          <w:bCs/>
+          <w:sz w:val="20"/>
+          <w:szCs w:val="20"/>
+          <w:lang w:val="es-ES_tradnl"/>
+        </w:rPr>
+        <w:t xml:space="preserve">modificar </w:t>
+      </w:r>
+      <w:r>
+        <w:rPr>
+          <w:rFonts w:ascii="Arial" w:hAnsi="Arial" w:cs="Arial"/>
+          <w:bCs/>
+          <w:sz w:val="20"/>
+          <w:szCs w:val="20"/>
+          <w:lang w:val="es-ES_tradnl"/>
+        </w:rPr>
+        <w:t>la orden de pago descrita.</w:t>
+      </w:r>
     </w:p>
     <w:p>
       <w:pPr>
-        <w:spacing w:after="0" w:line="200" w:lineRule="atLeast"/>
-        <w:ind w:left="1418" w:right="1416"/>
+        <w:spacing w:after="0" w:line="0" w:lineRule="atLeast"/>
+        <w:ind w:left="1418" w:right="1418"/>
         <w:jc w:val="both"/>
         <w:rPr>
           <w:rFonts w:ascii="Arial" w:hAnsi="Arial" w:cs="Arial"/>
@@ -2062,88 +2182,141 @@
           <w:lang w:val="es-ES_tradnl"/>
         </w:rPr>
       </w:pPr>
-      <w:r>
-        <w:rPr>
-          <w:rFonts w:ascii="Arial" w:hAnsi="Arial" w:cs="Arial"/>
-          <w:bCs/>
-          <w:sz w:val="20"/>
-          <w:szCs w:val="20"/>
-          <w:lang w:val="es-ES_tradnl"/>
-        </w:rPr>
-        <w:t xml:space="preserve">Que, la declaración rectificatoria presentada por el contribuyente ha surtido sus efectos (únicamente en mérito a la norma descrita, siendo necesario indicar que no se ha validado la información consignada en la declaración rectificatoria), por lo que corresponde </w:t>
-      </w:r>
-      <w:r>
-        <w:rPr>
-          <w:rFonts w:ascii="Arial" w:hAnsi="Arial" w:cs="Arial"/>
-          <w:b/>
-          <w:bCs/>
-          <w:sz w:val="20"/>
-          <w:szCs w:val="20"/>
-          <w:lang w:val="es-ES_tradnl"/>
-        </w:rPr>
-        <w:t xml:space="preserve">modificar </w:t>
-      </w:r>
-      <w:r>
-        <w:rPr>
-          <w:rFonts w:ascii="Arial" w:hAnsi="Arial" w:cs="Arial"/>
-          <w:bCs/>
-          <w:sz w:val="20"/>
-          <w:szCs w:val="20"/>
-          <w:lang w:val="es-ES_tradnl"/>
-        </w:rPr>
-        <w:t>la orden de pago descrita.</w:t>
-      </w:r>
     </w:p>
     <w:p>
       <w:pPr>
-        <w:spacing w:after="0" w:line="200" w:lineRule="atLeast"/>
-        <w:ind w:left="1418" w:right="1416"/>
+        <w:spacing w:after="0"/>
+        <w:ind w:firstLine="284"/>
         <w:jc w:val="both"/>
         <w:rPr>
           <w:rFonts w:ascii="Arial" w:hAnsi="Arial" w:cs="Arial"/>
-          <w:b/>
-          <w:bCs/>
-          <w:sz w:val="20"/>
-          <w:szCs w:val="20"/>
-          <w:lang w:val="es-ES_tradnl"/>
-        </w:rPr>
-      </w:pPr>
+          <w:bCs/>
+          <w:sz w:val="20"/>
+          <w:szCs w:val="20"/>
+          <w:lang w:val="es-ES_tradnl"/>
+        </w:rPr>
+      </w:pPr>
+      <w:r>
+        <w:rPr>
+          <w:rFonts w:ascii="Arial" w:hAnsi="Arial" w:cs="Arial"/>
+          <w:bCs/>
+          <w:sz w:val="20"/>
+          <w:szCs w:val="20"/>
+          <w:lang w:val="es-ES_tradnl"/>
+        </w:rPr>
+        <w:t>{{TEXTO_LIBRE}}</w:t>
+      </w:r>
     </w:p>
     <w:p>
       <w:pPr>
-        <w:spacing w:after="0" w:line="200" w:lineRule="atLeast"/>
-        <w:ind w:left="1418" w:right="1416"/>
+        <w:spacing w:after="0" w:line="0" w:lineRule="atLeast"/>
+        <w:ind w:left="1418" w:right="1418"/>
         <w:jc w:val="both"/>
         <w:rPr>
           <w:rFonts w:ascii="Arial" w:hAnsi="Arial" w:cs="Arial"/>
-          <w:bCs/>
-          <w:sz w:val="20"/>
-          <w:szCs w:val="20"/>
-        </w:rPr>
-      </w:pPr>
-      <w:r>
-        <w:rPr>
-          <w:rFonts w:ascii="Arial" w:hAnsi="Arial" w:cs="Arial"/>
-          <w:bCs/>
-          <w:sz w:val="20"/>
-          <w:szCs w:val="20"/>
-        </w:rPr>
-        <w:t>En uso de las facultades conferidas por la Ley General de la Superintendencia Nacional de Aduanas y de Administración Tributaria - SUNAT, aprobada por el Decreto Legislativo N.° 501 y modificatorias y conforme a lo dispuesto en el literal o) del artículo 4° de Texto Integrado del Reglamento de Organización y Funciones (ROF) de la Superintendencia Nacional de Aduanas y de Administración Tributaria aprobado por la Resolución de Superintendencia N.° 159-2024/SUNAT</w:t>
-      </w:r>
-      <w:r>
-        <w:rPr>
-          <w:rFonts w:ascii="Arial" w:hAnsi="Arial" w:cs="Arial"/>
-          <w:bCs/>
-          <w:sz w:val="20"/>
-          <w:szCs w:val="20"/>
-        </w:rPr>
-        <w:t>.</w:t>
-      </w:r>
+          <w:b/>
+          <w:bCs/>
+          <w:sz w:val="20"/>
+          <w:szCs w:val="20"/>
+          <w:lang w:val="es-ES_tradnl"/>
+        </w:rPr>
+      </w:pPr>
     </w:p>
     <w:p>
       <w:pPr>
-        <w:spacing w:after="0" w:line="200" w:lineRule="atLeast"/>
-        <w:ind w:left="1418" w:right="1416"/>
+        <w:spacing w:after="0" w:line="0" w:lineRule="atLeast"/>
+        <w:ind w:left="1418" w:right="1418"/>
+        <w:jc w:val="both"/>
+        <w:rPr>
+          <w:rFonts w:ascii="Arial" w:hAnsi="Arial" w:cs="Arial"/>
+          <w:bCs/>
+          <w:sz w:val="20"/>
+          <w:szCs w:val="20"/>
+        </w:rPr>
+      </w:pPr>
+      <w:r>
+        <w:rPr>
+          <w:rFonts w:ascii="Arial" w:hAnsi="Arial" w:cs="Arial"/>
+          <w:bCs/>
+          <w:sz w:val="20"/>
+          <w:szCs w:val="20"/>
+        </w:rPr>
+        <w:t xml:space="preserve">En uso de las facultades conferidas por la Ley General de la Superintendencia Nacional de Aduanas y de Administración Tributaria - SUNAT, aprobada por el Decreto Legislativo </w:t>
+      </w:r>
+      <w:proofErr w:type="spellStart"/>
+      <w:r>
+        <w:rPr>
+          <w:rFonts w:ascii="Arial" w:hAnsi="Arial" w:cs="Arial"/>
+          <w:bCs/>
+          <w:sz w:val="20"/>
+          <w:szCs w:val="20"/>
+        </w:rPr>
+        <w:t>N.°</w:t>
+      </w:r>
+      <w:proofErr w:type="spellEnd"/>
+      <w:r>
+        <w:rPr>
+          <w:rFonts w:ascii="Arial" w:hAnsi="Arial" w:cs="Arial"/>
+          <w:bCs/>
+          <w:sz w:val="20"/>
+          <w:szCs w:val="20"/>
+        </w:rPr>
+        <w:t xml:space="preserve"> 501 y modificatorias y conforme a lo dispuesto en el literal o) del artículo 4° de Texto Integrado del Reglamento de Organización y Funciones (ROF) de la Superintendencia Nacional de Aduanas y de Administración Tributaria aprobado por la Resolución de Superintendencia </w:t>
+      </w:r>
+      <w:proofErr w:type="spellStart"/>
+      <w:r>
+        <w:rPr>
+          <w:rFonts w:ascii="Arial" w:hAnsi="Arial" w:cs="Arial"/>
+          <w:bCs/>
+          <w:sz w:val="20"/>
+          <w:szCs w:val="20"/>
+        </w:rPr>
+        <w:t>N.°</w:t>
+      </w:r>
+      <w:proofErr w:type="spellEnd"/>
+      <w:r>
+        <w:rPr>
+          <w:rFonts w:ascii="Arial" w:hAnsi="Arial" w:cs="Arial"/>
+          <w:bCs/>
+          <w:sz w:val="20"/>
+          <w:szCs w:val="20"/>
+        </w:rPr>
+        <w:t xml:space="preserve"> 159-2024/SUNAT; y en ejercicio de la facultad de delegación de firmas señalada en el artículo 72° del TUO de la Ley del Procedimiento Administrativo General - Ley </w:t>
+      </w:r>
+      <w:proofErr w:type="spellStart"/>
+      <w:r>
+        <w:rPr>
+          <w:rFonts w:ascii="Arial" w:hAnsi="Arial" w:cs="Arial"/>
+          <w:bCs/>
+          <w:sz w:val="20"/>
+          <w:szCs w:val="20"/>
+        </w:rPr>
+        <w:t>N.°</w:t>
+      </w:r>
+      <w:proofErr w:type="spellEnd"/>
+      <w:r>
+        <w:rPr>
+          <w:rFonts w:ascii="Arial" w:hAnsi="Arial" w:cs="Arial"/>
+          <w:bCs/>
+          <w:sz w:val="20"/>
+          <w:szCs w:val="20"/>
+        </w:rPr>
+        <w:t xml:space="preserve"> 27444</w:t>
+      </w:r>
+      <w:r>
+        <w:rPr>
+          <w:rFonts w:ascii="Arial" w:hAnsi="Arial" w:cs="Arial"/>
+          <w:bCs/>
+          <w:sz w:val="20"/>
+          <w:szCs w:val="20"/>
+        </w:rPr>
+        <w:t>.</w:t>
+      </w:r>
+    </w:p>
+    <w:p>
+      <w:pPr>
+        <w:spacing w:after="0" w:line="0" w:lineRule="atLeast"/>
+        <w:ind w:left="0" w:right="1418"/>
         <w:jc w:val="both"/>
         <w:rPr>
           <w:rFonts w:ascii="Arial" w:hAnsi="Arial" w:cs="Arial"/>
@@ -2237,7 +2410,7 @@
                     </pic:cNvPicPr>
                   </pic:nvPicPr>
                   <pic:blipFill rotWithShape="1">
-                    <a:blip r:embed="rId14">
+                    <a:blip r:embed="rId13">
                       <a:extLst>
                         <a:ext uri="{28A0092B-C50C-407E-A947-70E740481C1C}">
                           <a14:useLocalDpi xmlns:a14="http://schemas.microsoft.com/office/drawing/2010/main" val="0"/>
@@ -2342,6 +2515,35 @@
       <w:r>
         <w:rPr>
           <w:rFonts w:ascii="Arial" w:hAnsi="Arial" w:cs="Arial"/>
+          <w:sz w:val="20"/>
+          <w:szCs w:val="20"/>
+          <w:lang w:val="es-ES_tradnl"/>
+        </w:rPr>
+        <w:t xml:space="preserve">Expediente </w:t>
+      </w:r>
+      <w:proofErr w:type="spellStart"/>
+      <w:r>
+        <w:rPr>
+          <w:rFonts w:ascii="Arial" w:hAnsi="Arial" w:cs="Arial"/>
+          <w:sz w:val="20"/>
+          <w:szCs w:val="20"/>
+          <w:lang w:val="es-ES_tradnl"/>
+        </w:rPr>
+        <w:t>N.°</w:t>
+      </w:r>
+      <w:proofErr w:type="spellEnd"/>
+      <w:r>
+        <w:rPr>
+          <w:rFonts w:ascii="Arial" w:hAnsi="Arial" w:cs="Arial"/>
+          <w:sz w:val="20"/>
+          <w:szCs w:val="20"/>
+          <w:lang w:val="es-ES_tradnl"/>
+        </w:rPr>
+        <w:t xml:space="preserve"> </w:t>
+      </w:r>
+      <w:r>
+        <w:rPr>
+          <w:rFonts w:ascii="Arial" w:hAnsi="Arial" w:cs="Arial"/>
           <w:bCs/>
           <w:sz w:val="20"/>
           <w:szCs w:val="20"/>
@@ -2355,7 +2557,16 @@
           <w:sz w:val="20"/>
           <w:szCs w:val="20"/>
         </w:rPr>
-        <w:t xml:space="preserve"> - </w:t>
+        <w:t xml:space="preserve"> </w:t>
+      </w:r>
+      <w:r>
+        <w:rPr>
+          <w:rFonts w:ascii="Arial" w:hAnsi="Arial" w:cs="Arial"/>
+          <w:bCs/>
+          <w:sz w:val="20"/>
+          <w:szCs w:val="20"/>
+        </w:rPr>
+        <w:t xml:space="preserve">generado por la emisión de oficio del </w:t>
       </w:r>
       <w:r>
         <w:rPr>
@@ -2442,10 +2653,9 @@
       <w:r>
         <w:rPr>
           <w:rFonts w:ascii="Arial" w:hAnsi="Arial" w:cs="Arial"/>
-          <w:bCs/>
-          <w:sz w:val="20"/>
-          <w:szCs w:val="20"/>
-          <w:lang w:val="es-ES_tradnl"/>
+          <w:b/>
+          <w:sz w:val="20"/>
+          <w:szCs w:val="20"/>
         </w:rPr>
         <w:t xml:space="preserve"> </w:t>
       </w:r>
@@ -2884,6 +3094,7 @@
                 <w:rFonts w:ascii="Arial" w:eastAsia="Times New Roman" w:hAnsi="Arial" w:cs="Arial"/>
                 <w:sz w:val="20"/>
                 <w:szCs w:val="20"/>
+                <w:highlight w:val="yellow"/>
                 <w:lang w:val="es-ES_tradnl" w:eastAsia="es-ES"/>
               </w:rPr>
             </w:pPr>
@@ -2926,6 +3137,7 @@
                 <w:rFonts w:ascii="Arial" w:eastAsia="Times New Roman" w:hAnsi="Arial" w:cs="Arial"/>
                 <w:sz w:val="20"/>
                 <w:szCs w:val="20"/>
+                <w:highlight w:val="yellow"/>
                 <w:lang w:val="es-ES_tradnl" w:eastAsia="es-ES"/>
               </w:rPr>
             </w:pPr>
@@ -2966,6 +3178,7 @@
                 <w:rFonts w:ascii="Arial" w:eastAsia="Times New Roman" w:hAnsi="Arial" w:cs="Arial"/>
                 <w:sz w:val="20"/>
                 <w:szCs w:val="20"/>
+                <w:highlight w:val="yellow"/>
                 <w:lang w:val="es-ES_tradnl" w:eastAsia="es-ES"/>
               </w:rPr>
             </w:pPr>
@@ -3005,6 +3218,7 @@
                 <w:rFonts w:ascii="Arial" w:eastAsia="Times New Roman" w:hAnsi="Arial" w:cs="Arial"/>
                 <w:sz w:val="20"/>
                 <w:szCs w:val="20"/>
+                <w:highlight w:val="yellow"/>
                 <w:lang w:val="es-ES_tradnl" w:eastAsia="es-ES"/>
               </w:rPr>
             </w:pPr>
@@ -3044,6 +3258,7 @@
                 <w:rFonts w:ascii="Arial" w:eastAsia="Times New Roman" w:hAnsi="Arial" w:cs="Arial"/>
                 <w:sz w:val="20"/>
                 <w:szCs w:val="20"/>
+                <w:highlight w:val="yellow"/>
                 <w:lang w:val="es-ES_tradnl" w:eastAsia="es-ES"/>
               </w:rPr>
             </w:pPr>
@@ -3083,6 +3298,7 @@
                 <w:rFonts w:ascii="Arial" w:eastAsia="Times New Roman" w:hAnsi="Arial" w:cs="Arial"/>
                 <w:sz w:val="20"/>
                 <w:szCs w:val="20"/>
+                <w:highlight w:val="yellow"/>
                 <w:lang w:val="es-ES_tradnl" w:eastAsia="es-ES"/>
               </w:rPr>
             </w:pPr>
@@ -3141,7 +3357,25 @@
           <w:sz w:val="20"/>
           <w:szCs w:val="20"/>
         </w:rPr>
-        <w:t xml:space="preserve">. - La Superintendencia Nacional de Aduanas y de Administración Tributaria se reserva el derecho de practicar una verificación y/o fiscalización con posterioridad al presente acto, dentro de los plazos de prescripción previstos en el Texto Único Ordenado del Código Tributario, aprobado por el Decreto Supremo N.° 133-2013-EF y normas modificatorias, sin perjuicio de aplicar las sanciones pertinentes </w:t>
+        <w:t xml:space="preserve">. - La Superintendencia Nacional de Aduanas y de Administración Tributaria se reserva el derecho de practicar una verificación y/o fiscalización con posterioridad al presente acto, dentro de los plazos de prescripción previstos en el Texto Único Ordenado del Código Tributario, aprobado por el Decreto Supremo </w:t>
+      </w:r>
+      <w:proofErr w:type="spellStart"/>
+      <w:r>
+        <w:rPr>
+          <w:rFonts w:ascii="Arial" w:hAnsi="Arial" w:cs="Arial"/>
+          <w:sz w:val="20"/>
+          <w:szCs w:val="20"/>
+        </w:rPr>
+        <w:t>N.°</w:t>
+      </w:r>
+      <w:proofErr w:type="spellEnd"/>
+      <w:r>
+        <w:rPr>
+          <w:rFonts w:ascii="Arial" w:hAnsi="Arial" w:cs="Arial"/>
+          <w:sz w:val="20"/>
+          <w:szCs w:val="20"/>
+        </w:rPr>
+        <w:t xml:space="preserve"> 133-2013-EF y normas modificatorias, sin perjuicio de aplicar las sanciones pertinentes </w:t>
       </w:r>
       <w:proofErr w:type="gramStart"/>
       <w:r>
@@ -3183,76 +3417,23 @@
           <w:lang w:val="es-ES_tradnl"/>
         </w:rPr>
       </w:pPr>
-    </w:p>
-    <w:p>
-      <w:pPr>
-        <w:spacing w:after="0" w:line="200" w:lineRule="atLeast"/>
-        <w:ind w:firstLine="284"/>
-        <w:jc w:val="both"/>
-        <w:rPr>
-          <w:rFonts w:ascii="Arial" w:hAnsi="Arial" w:cs="Arial"/>
-          <w:color w:val="000000" w:themeColor="text1"/>
-          <w:sz w:val="20"/>
-          <w:szCs w:val="20"/>
-        </w:rPr>
-      </w:pPr>
-      <w:r>
-        <w:rPr>
-          <w:rFonts w:ascii="Arial" w:hAnsi="Arial" w:cs="Arial"/>
-          <w:bCs/>
-          <w:sz w:val="20"/>
-          <w:szCs w:val="20"/>
-          <w:lang w:val="es-ES_tradnl"/>
-        </w:rPr>
-        <w:t>Regístrese, comuníquese y archívese</w:t>
-      </w:r>
-      <w:r>
-        <w:rPr>
-          <w:rStyle w:val="FootnoteReference"/>
-          <w:rFonts w:ascii="Arial" w:hAnsi="Arial" w:cs="Arial"/>
-          <w:sz w:val="20"/>
-          <w:szCs w:val="20"/>
-        </w:rPr>
-        <w:footnoteReference w:id="1"/>
-      </w:r>
-      <w:r>
-        <w:rPr>
-          <w:rFonts w:ascii="Arial" w:hAnsi="Arial" w:cs="Arial"/>
-          <w:color w:val="000000" w:themeColor="text1"/>
-          <w:sz w:val="20"/>
-          <w:szCs w:val="20"/>
-        </w:rPr>
-        <w:t>.</w:t>
-      </w:r>
-    </w:p>
-    <w:p>
-      <w:pPr>
-        <w:spacing w:after="0"/>
-        <w:jc w:val="center"/>
-        <w:rPr>
-          <w:rFonts w:ascii="Arial" w:hAnsi="Arial" w:cs="Arial"/>
-          <w:color w:val="000000" w:themeColor="text1"/>
-          <w:sz w:val="20"/>
-          <w:szCs w:val="20"/>
-        </w:rPr>
-      </w:pPr>
       <w:r>
         <w:rPr>
           <w:noProof/>
         </w:rPr>
         <w:drawing>
-          <wp:anchor distT="0" distB="0" distL="114300" distR="114300" simplePos="0" relativeHeight="251677696" behindDoc="1" locked="0" layoutInCell="1" allowOverlap="1" wp14:anchorId="5C9BC121" wp14:editId="23970FA0">
+          <wp:anchor distT="0" distB="0" distL="114300" distR="114300" simplePos="0" relativeHeight="251677696" behindDoc="1" locked="0" layoutInCell="1" allowOverlap="1" wp14:anchorId="394829DD" wp14:editId="6DF59243">
             <wp:simplePos x="0" y="0"/>
             <wp:positionH relativeFrom="margin">
-              <wp:align>center</wp:align>
+              <wp:posOffset>2520564</wp:posOffset>
             </wp:positionH>
             <wp:positionV relativeFrom="paragraph">
-              <wp:posOffset>419100</wp:posOffset>
+              <wp:posOffset>13804</wp:posOffset>
             </wp:positionV>
-            <wp:extent cx="1854251" cy="864559"/>
-            <wp:effectExtent l="0" t="0" r="0" b="0"/>
+            <wp:extent cx="2316559" cy="1290210"/>
+            <wp:effectExtent l="0" t="0" r="7620" b="5715"/>
             <wp:wrapNone/>
-            <wp:docPr id="2046195723" name="Imagen 1" descr="Texto, Carta&#10;&#10;El contenido generado por IA puede ser incorrecto."/>
+            <wp:docPr id="1306679053" name="Imagen 1"/>
             <wp:cNvGraphicFramePr>
               <a:graphicFrameLocks xmlns:a="http://schemas.openxmlformats.org/drawingml/2006/main" noChangeAspect="1"/>
             </wp:cNvGraphicFramePr>
@@ -3260,29 +3441,41 @@
               <a:graphicData uri="http://schemas.openxmlformats.org/drawingml/2006/picture">
                 <pic:pic xmlns:pic="http://schemas.openxmlformats.org/drawingml/2006/picture">
                   <pic:nvPicPr>
-                    <pic:cNvPr id="2046195723" name="Imagen 1" descr="Texto, Carta&#10;&#10;El contenido generado por IA puede ser incorrecto."/>
-                    <pic:cNvPicPr/>
+                    <pic:cNvPr id="0" name="Picture 1"/>
+                    <pic:cNvPicPr>
+                      <a:picLocks noChangeAspect="1" noChangeArrowheads="1"/>
+                    </pic:cNvPicPr>
                   </pic:nvPicPr>
-                  <pic:blipFill>
-                    <a:blip r:embed="rId15">
+                  <pic:blipFill rotWithShape="1">
+                    <a:blip r:embed="rId14" r:link="rId15">
                       <a:extLst>
                         <a:ext uri="{28A0092B-C50C-407E-A947-70E740481C1C}">
                           <a14:useLocalDpi xmlns:a14="http://schemas.microsoft.com/office/drawing/2010/main" val="0"/>
                         </a:ext>
                       </a:extLst>
                     </a:blip>
+                    <a:srcRect l="4950" t="12735" r="5683" b="11954"/>
                     <a:stretch>
                       <a:fillRect/>
                     </a:stretch>
                   </pic:blipFill>
-                  <pic:spPr>
+                  <pic:spPr bwMode="auto">
                     <a:xfrm>
                       <a:off x="0" y="0"/>
-                      <a:ext cx="1854251" cy="864559"/>
+                      <a:ext cx="2316559" cy="1290210"/>
                     </a:xfrm>
                     <a:prstGeom prst="rect">
                       <a:avLst/>
                     </a:prstGeom>
+                    <a:noFill/>
+                    <a:ln>
+                      <a:noFill/>
+                    </a:ln>
+                    <a:extLst>
+                      <a:ext uri="{53640926-AAD7-44D8-BBD7-CCE9431645EC}">
+                        <a14:shadowObscured xmlns:a14="http://schemas.microsoft.com/office/drawing/2010/main"/>
+                      </a:ext>
+                    </a:extLst>
                   </pic:spPr>
                 </pic:pic>
               </a:graphicData>
@@ -3296,6 +3489,59 @@
           </wp:anchor>
         </w:drawing>
       </w:r>
+    </w:p>
+    <w:p>
+      <w:pPr>
+        <w:spacing w:after="0" w:line="200" w:lineRule="atLeast"/>
+        <w:ind w:firstLine="284"/>
+        <w:jc w:val="both"/>
+        <w:rPr>
+          <w:rFonts w:ascii="Arial" w:hAnsi="Arial" w:cs="Arial"/>
+          <w:color w:val="000000" w:themeColor="text1"/>
+          <w:sz w:val="20"/>
+          <w:szCs w:val="20"/>
+        </w:rPr>
+      </w:pPr>
+      <w:r>
+        <w:rPr>
+          <w:rFonts w:ascii="Arial" w:hAnsi="Arial" w:cs="Arial"/>
+          <w:bCs/>
+          <w:sz w:val="20"/>
+          <w:szCs w:val="20"/>
+          <w:lang w:val="es-ES_tradnl"/>
+        </w:rPr>
+        <w:t>Regístrese, comuníquese y archívese</w:t>
+      </w:r>
+      <w:r>
+        <w:rPr>
+          <w:rStyle w:val="FootnoteReference"/>
+          <w:rFonts w:ascii="Arial" w:hAnsi="Arial" w:cs="Arial"/>
+          <w:sz w:val="20"/>
+          <w:szCs w:val="20"/>
+        </w:rPr>
+        <w:footnoteReference w:id="1"/>
+      </w:r>
+      <w:r>
+        <w:rPr>
+          <w:rFonts w:ascii="Arial" w:hAnsi="Arial" w:cs="Arial"/>
+          <w:color w:val="000000" w:themeColor="text1"/>
+          <w:sz w:val="20"/>
+          <w:szCs w:val="20"/>
+        </w:rPr>
+        <w:t>.</w:t>
+      </w:r>
+    </w:p>
+    <w:p>
+      <w:pPr>
+        <w:spacing w:after="0"/>
+        <w:jc w:val="center"/>
+        <w:rPr>
+          <w:rFonts w:ascii="Arial" w:hAnsi="Arial" w:cs="Arial"/>
+          <w:color w:val="000000" w:themeColor="text1"/>
+          <w:sz w:val="20"/>
+          <w:szCs w:val="20"/>
+        </w:rPr>
+      </w:pPr>
     </w:p>
     <w:sectPr>
       <w:headerReference w:type="default" r:id="rId16"/>
@@ -8198,130 +8444,130 @@
       </w:rPr>
     </w:lvl>
   </w:abstractNum>
-  <w:num w:numId="1" w16cid:durableId="1215119044">
+  <w:num w:numId="1" w16cid:durableId="768892031">
     <w:abstractNumId w:val="0"/>
   </w:num>
-  <w:num w:numId="2" w16cid:durableId="1010108346">
+  <w:num w:numId="2" w16cid:durableId="1127047732">
     <w:abstractNumId w:val="24"/>
   </w:num>
-  <w:num w:numId="3" w16cid:durableId="337587499">
+  <w:num w:numId="3" w16cid:durableId="1550799285">
     <w:abstractNumId w:val="12"/>
   </w:num>
-  <w:num w:numId="4" w16cid:durableId="1495338969">
+  <w:num w:numId="4" w16cid:durableId="793057646">
     <w:abstractNumId w:val="19"/>
   </w:num>
-  <w:num w:numId="5" w16cid:durableId="810052105">
+  <w:num w:numId="5" w16cid:durableId="1713267146">
     <w:abstractNumId w:val="21"/>
   </w:num>
-  <w:num w:numId="6" w16cid:durableId="777140971">
+  <w:num w:numId="6" w16cid:durableId="247352504">
     <w:abstractNumId w:val="2"/>
   </w:num>
-  <w:num w:numId="7" w16cid:durableId="2119635922">
+  <w:num w:numId="7" w16cid:durableId="642975396">
     <w:abstractNumId w:val="20"/>
   </w:num>
-  <w:num w:numId="8" w16cid:durableId="488639694">
+  <w:num w:numId="8" w16cid:durableId="1194028629">
     <w:abstractNumId w:val="32"/>
   </w:num>
-  <w:num w:numId="9" w16cid:durableId="2125611928">
+  <w:num w:numId="9" w16cid:durableId="731972395">
     <w:abstractNumId w:val="1"/>
   </w:num>
-  <w:num w:numId="10" w16cid:durableId="1743135608">
+  <w:num w:numId="10" w16cid:durableId="1128233649">
     <w:abstractNumId w:val="40"/>
   </w:num>
-  <w:num w:numId="11" w16cid:durableId="1755198708">
+  <w:num w:numId="11" w16cid:durableId="1564415710">
     <w:abstractNumId w:val="6"/>
   </w:num>
-  <w:num w:numId="12" w16cid:durableId="728387320">
+  <w:num w:numId="12" w16cid:durableId="1307473018">
     <w:abstractNumId w:val="37"/>
   </w:num>
-  <w:num w:numId="13" w16cid:durableId="1392387452">
+  <w:num w:numId="13" w16cid:durableId="1676612327">
     <w:abstractNumId w:val="17"/>
   </w:num>
-  <w:num w:numId="14" w16cid:durableId="1289580812">
+  <w:num w:numId="14" w16cid:durableId="921990087">
     <w:abstractNumId w:val="7"/>
   </w:num>
-  <w:num w:numId="15" w16cid:durableId="651522438">
+  <w:num w:numId="15" w16cid:durableId="1130441124">
     <w:abstractNumId w:val="16"/>
   </w:num>
-  <w:num w:numId="16" w16cid:durableId="1602296970">
+  <w:num w:numId="16" w16cid:durableId="205679745">
     <w:abstractNumId w:val="11"/>
   </w:num>
-  <w:num w:numId="17" w16cid:durableId="336427217">
+  <w:num w:numId="17" w16cid:durableId="1856576199">
     <w:abstractNumId w:val="25"/>
   </w:num>
-  <w:num w:numId="18" w16cid:durableId="1155727404">
+  <w:num w:numId="18" w16cid:durableId="1263612931">
     <w:abstractNumId w:val="28"/>
   </w:num>
-  <w:num w:numId="19" w16cid:durableId="1480028692">
+  <w:num w:numId="19" w16cid:durableId="970282404">
     <w:abstractNumId w:val="8"/>
   </w:num>
-  <w:num w:numId="20" w16cid:durableId="862401339">
+  <w:num w:numId="20" w16cid:durableId="13269835">
     <w:abstractNumId w:val="27"/>
   </w:num>
-  <w:num w:numId="21" w16cid:durableId="419253501">
+  <w:num w:numId="21" w16cid:durableId="1294213553">
     <w:abstractNumId w:val="22"/>
   </w:num>
-  <w:num w:numId="22" w16cid:durableId="1431048085">
+  <w:num w:numId="22" w16cid:durableId="368453768">
     <w:abstractNumId w:val="41"/>
   </w:num>
-  <w:num w:numId="23" w16cid:durableId="108790595">
+  <w:num w:numId="23" w16cid:durableId="1257594887">
     <w:abstractNumId w:val="18"/>
   </w:num>
-  <w:num w:numId="24" w16cid:durableId="1441299846">
+  <w:num w:numId="24" w16cid:durableId="828132065">
     <w:abstractNumId w:val="5"/>
   </w:num>
-  <w:num w:numId="25" w16cid:durableId="1401637362">
+  <w:num w:numId="25" w16cid:durableId="486868550">
     <w:abstractNumId w:val="10"/>
   </w:num>
-  <w:num w:numId="26" w16cid:durableId="150761192">
+  <w:num w:numId="26" w16cid:durableId="1726904422">
     <w:abstractNumId w:val="35"/>
   </w:num>
-  <w:num w:numId="27" w16cid:durableId="2021538461">
+  <w:num w:numId="27" w16cid:durableId="924537998">
     <w:abstractNumId w:val="34"/>
   </w:num>
-  <w:num w:numId="28" w16cid:durableId="1745445521">
+  <w:num w:numId="28" w16cid:durableId="374625183">
     <w:abstractNumId w:val="39"/>
   </w:num>
-  <w:num w:numId="29" w16cid:durableId="615260440">
+  <w:num w:numId="29" w16cid:durableId="293828359">
     <w:abstractNumId w:val="15"/>
   </w:num>
-  <w:num w:numId="30" w16cid:durableId="1308903374">
+  <w:num w:numId="30" w16cid:durableId="57946389">
     <w:abstractNumId w:val="4"/>
   </w:num>
-  <w:num w:numId="31" w16cid:durableId="2010214637">
+  <w:num w:numId="31" w16cid:durableId="1259871134">
     <w:abstractNumId w:val="14"/>
   </w:num>
-  <w:num w:numId="32" w16cid:durableId="180359165">
+  <w:num w:numId="32" w16cid:durableId="1751147866">
     <w:abstractNumId w:val="26"/>
   </w:num>
-  <w:num w:numId="33" w16cid:durableId="47456344">
+  <w:num w:numId="33" w16cid:durableId="855076495">
     <w:abstractNumId w:val="31"/>
   </w:num>
-  <w:num w:numId="34" w16cid:durableId="443692989">
+  <w:num w:numId="34" w16cid:durableId="148710609">
     <w:abstractNumId w:val="13"/>
   </w:num>
-  <w:num w:numId="35" w16cid:durableId="45689158">
+  <w:num w:numId="35" w16cid:durableId="153760435">
     <w:abstractNumId w:val="38"/>
   </w:num>
-  <w:num w:numId="36" w16cid:durableId="782459200">
+  <w:num w:numId="36" w16cid:durableId="1057703440">
     <w:abstractNumId w:val="23"/>
   </w:num>
-  <w:num w:numId="37" w16cid:durableId="510292923">
+  <w:num w:numId="37" w16cid:durableId="1767799377">
     <w:abstractNumId w:val="30"/>
   </w:num>
-  <w:num w:numId="38" w16cid:durableId="141972337">
+  <w:num w:numId="38" w16cid:durableId="1456021556">
     <w:abstractNumId w:val="3"/>
   </w:num>
-  <w:num w:numId="39" w16cid:durableId="414400755">
+  <w:num w:numId="39" w16cid:durableId="999962155">
     <w:abstractNumId w:val="33"/>
   </w:num>
-  <w:num w:numId="40" w16cid:durableId="1635258295">
+  <w:num w:numId="40" w16cid:durableId="1669942284">
     <w:abstractNumId w:val="36"/>
   </w:num>
-  <w:num w:numId="41" w16cid:durableId="483161958">
+  <w:num w:numId="41" w16cid:durableId="80614029">
     <w:abstractNumId w:val="29"/>
   </w:num>
-  <w:num w:numId="42" w16cid:durableId="930238106">
+  <w:num w:numId="42" w16cid:durableId="1309628319">
     <w:abstractNumId w:val="9"/>
   </w:num>
 </w:numbering>
@@ -10113,6 +10359,38 @@
 </file>
 
 <file path=customXml/item1.xml><?xml version="1.0" encoding="utf-8"?>
+<?mso-contentType ?>
+<FormTemplates xmlns="http://schemas.microsoft.com/sharepoint/v3/contenttype/forms">
+  <Display>DocumentLibraryForm</Display>
+  <Edit>DocumentLibraryForm</Edit>
+  <New>DocumentLibraryForm</New>
+</FormTemplates>
+</file>
+
+<file path=customXml/item2.xml><?xml version="1.0" encoding="utf-8"?>
+<b:Sources xmlns:w="http://schemas.openxmlformats.org/wordprocessingml/2006/main" xmlns:w15="http://schemas.microsoft.com/office/word/2012/wordml" xmlns:w14="http://schemas.microsoft.com/office/word/2010/wordml" xmlns:r="http://schemas.openxmlformats.org/officeDocument/2006/relationships" xmlns:m="http://schemas.openxmlformats.org/officeDocument/2006/math" xmlns:wp="http://schemas.openxmlformats.org/drawingml/2006/wordprocessingDrawing" xmlns:a="http://schemas.openxmlformats.org/drawingml/2006/main" xmlns:wp14="http://schemas.microsoft.com/office/word/2010/wordprocessingDrawing" xmlns:mc="http://schemas.openxmlformats.org/markup-compatibility/2006" xmlns:sl="http://schemas.openxmlformats.org/schemaLibrary/2006/main" xmlns:wne="http://schemas.microsoft.com/office/word/2006/wordml" xmlns:c="http://schemas.openxmlformats.org/drawingml/2006/chart" xmlns:cdr="http://schemas.openxmlformats.org/drawingml/2006/chartDrawing" xmlns:c14="http://schemas.microsoft.com/office/drawing/2007/8/2/chart" xmlns:dgm="http://schemas.openxmlformats.org/drawingml/2006/diagram" xmlns:pic="http://schemas.openxmlformats.org/drawingml/2006/picture" xmlns:xdr="http://schemas.openxmlformats.org/drawingml/2006/spreadsheetDrawing" xmlns:dsp="http://schemas.microsoft.com/office/drawing/2008/diagram" xmlns:xvml="urn:schemas-microsoft-com:office:excel" xmlns:o="urn:schemas-microsoft-com:office:office" xmlns:w10="urn:schemas-microsoft-com:office:word" xmlns:v="urn:schemas-microsoft-com:vml" xmlns:pvml="urn:schemas-microsoft-com:office:powerpoint" xmlns:cppr="http://schemas.microsoft.com/office/2006/coverPageProps" xmlns:odx="http://opendope.org/xpaths" xmlns:odc="http://opendope.org/conditions" xmlns:odq="http://opendope.org/questions" xmlns:oda="http://opendope.org/answers" xmlns:odi="http://opendope.org/components" xmlns:odgm="http://opendope.org/SmartArt/DataHierarchy" xmlns:b="http://schemas.openxmlformats.org/officeDocument/2006/bibliography" xmlns:wps="http://schemas.microsoft.com/office/word/2010/wordprocessingShape" xmlns:w16se="http://schemas.microsoft.com/office/word/2015/wordml/symex" xmlns:w16cid="http://schemas.microsoft.com/office/word/2016/wordml/cid" xmlns:wetp="http://schemas.microsoft.com/office/webextensions/taskpanes/2010/11" xmlns:we="http://schemas.microsoft.com/office/webextensions/webextension/2010/11" xmlns:comp="http://schemas.openxmlformats.org/drawingml/2006/compatibility" xmlns:lc="http://schemas.openxmlformats.org/drawingml/2006/lockedCanvas" SelectedStyle="\APASixthEditionOfficeOnline.xsl" StyleName="APA"/>
+</file>
+
+<file path=customXml/item3.xml><?xml version="1.0" encoding="utf-8"?>
+<p:properties xmlns:p="http://schemas.microsoft.com/office/2006/metadata/properties" xmlns:xsi="http://www.w3.org/2001/XMLSchema-instance" xmlns:pc="http://schemas.microsoft.com/office/infopath/2007/PartnerControls">
+  <documentManagement>
+    <FALLO xmlns="b68ea25f-4c5d-467c-a666-be04225f8e58" xsi:nil="true"/>
+    <ESTADODELEXPEDIENTE xmlns="b68ea25f-4c5d-467c-a666-be04225f8e58" xsi:nil="true"/>
+    <REVISOR1 xmlns="b68ea25f-4c5d-467c-a666-be04225f8e58" xsi:nil="true"/>
+    <GERENTE xmlns="b68ea25f-4c5d-467c-a666-be04225f8e58" xsi:nil="true"/>
+    <COMENTARIO xmlns="b68ea25f-4c5d-467c-a666-be04225f8e58" xsi:nil="true"/>
+    <TIPODEEXPEDIENTE xmlns="b68ea25f-4c5d-467c-a666-be04225f8e58" xsi:nil="true"/>
+    <REVISOR2 xmlns="b68ea25f-4c5d-467c-a666-be04225f8e58" xsi:nil="true"/>
+    <SUMILLA xmlns="b68ea25f-4c5d-467c-a666-be04225f8e58" xsi:nil="true"/>
+    <lcf76f155ced4ddcb4097134ff3c332f xmlns="b68ea25f-4c5d-467c-a666-be04225f8e58">
+      <Terms xmlns="http://schemas.microsoft.com/office/infopath/2007/PartnerControls"/>
+    </lcf76f155ced4ddcb4097134ff3c332f>
+    <TaxCatchAll xmlns="680c7679-6e7d-4828-b830-7705079186f8" xsi:nil="true"/>
+  </documentManagement>
+</p:properties>
+</file>
+
+<file path=customXml/item4.xml><?xml version="1.0" encoding="utf-8"?>
 <ct:contentTypeSchema xmlns:ct="http://schemas.microsoft.com/office/2006/metadata/contentType" xmlns:ma="http://schemas.microsoft.com/office/2006/metadata/properties/metaAttributes" ct:_="" ma:_="" ma:contentTypeName="Documento" ma:contentTypeID="0x010100F03484BF32DBCB46AD20F0115C2F61FE" ma:contentTypeVersion="21" ma:contentTypeDescription="Crear nuevo documento." ma:contentTypeScope="" ma:versionID="9185667f7762df16a8b29aca4e52443e">
   <xsd:schema xmlns:xsd="http://www.w3.org/2001/XMLSchema" xmlns:xs="http://www.w3.org/2001/XMLSchema" xmlns:p="http://schemas.microsoft.com/office/2006/metadata/properties" xmlns:ns2="b68ea25f-4c5d-467c-a666-be04225f8e58" xmlns:ns3="680c7679-6e7d-4828-b830-7705079186f8" xmlns:ns4="d94663fc-0bbb-4c75-ad7b-31b0161adbbf" targetNamespace="http://schemas.microsoft.com/office/2006/metadata/properties" ma:root="true" ma:fieldsID="62dcf323065bb9201939f6f167e3127a" ns2:_="" ns3:_="" ns4:_="">
     <xsd:import namespace="b68ea25f-4c5d-467c-a666-be04225f8e58"/>
@@ -10424,59 +10702,7 @@
 </ct:contentTypeSchema>
 </file>
 
-<file path=customXml/item2.xml><?xml version="1.0" encoding="utf-8"?>
-<?mso-contentType ?>
-<FormTemplates xmlns="http://schemas.microsoft.com/sharepoint/v3/contenttype/forms">
-  <Display>DocumentLibraryForm</Display>
-  <Edit>DocumentLibraryForm</Edit>
-  <New>DocumentLibraryForm</New>
-</FormTemplates>
-</file>
-
-<file path=customXml/item3.xml><?xml version="1.0" encoding="utf-8"?>
-<b:Sources xmlns:w="http://schemas.openxmlformats.org/wordprocessingml/2006/main" xmlns:w15="http://schemas.microsoft.com/office/word/2012/wordml" xmlns:w14="http://schemas.microsoft.com/office/word/2010/wordml" xmlns:r="http://schemas.openxmlformats.org/officeDocument/2006/relationships" xmlns:m="http://schemas.openxmlformats.org/officeDocument/2006/math" xmlns:wp="http://schemas.openxmlformats.org/drawingml/2006/wordprocessingDrawing" xmlns:a="http://schemas.openxmlformats.org/drawingml/2006/main" xmlns:wp14="http://schemas.microsoft.com/office/word/2010/wordprocessingDrawing" xmlns:mc="http://schemas.openxmlformats.org/markup-compatibility/2006" xmlns:sl="http://schemas.openxmlformats.org/schemaLibrary/2006/main" xmlns:wne="http://schemas.microsoft.com/office/word/2006/wordml" xmlns:c="http://schemas.openxmlformats.org/drawingml/2006/chart" xmlns:cdr="http://schemas.openxmlformats.org/drawingml/2006/chartDrawing" xmlns:c14="http://schemas.microsoft.com/office/drawing/2007/8/2/chart" xmlns:dgm="http://schemas.openxmlformats.org/drawingml/2006/diagram" xmlns:pic="http://schemas.openxmlformats.org/drawingml/2006/picture" xmlns:xdr="http://schemas.openxmlformats.org/drawingml/2006/spreadsheetDrawing" xmlns:dsp="http://schemas.microsoft.com/office/drawing/2008/diagram" xmlns:xvml="urn:schemas-microsoft-com:office:excel" xmlns:o="urn:schemas-microsoft-com:office:office" xmlns:w10="urn:schemas-microsoft-com:office:word" xmlns:v="urn:schemas-microsoft-com:vml" xmlns:pvml="urn:schemas-microsoft-com:office:powerpoint" xmlns:cppr="http://schemas.microsoft.com/office/2006/coverPageProps" xmlns:odx="http://opendope.org/xpaths" xmlns:odc="http://opendope.org/conditions" xmlns:odq="http://opendope.org/questions" xmlns:oda="http://opendope.org/answers" xmlns:odi="http://opendope.org/components" xmlns:odgm="http://opendope.org/SmartArt/DataHierarchy" xmlns:b="http://schemas.openxmlformats.org/officeDocument/2006/bibliography" xmlns:wps="http://schemas.microsoft.com/office/word/2010/wordprocessingShape" xmlns:w16se="http://schemas.microsoft.com/office/word/2015/wordml/symex" xmlns:w16cid="http://schemas.microsoft.com/office/word/2016/wordml/cid" xmlns:wetp="http://schemas.microsoft.com/office/webextensions/taskpanes/2010/11" xmlns:we="http://schemas.microsoft.com/office/webextensions/webextension/2010/11" xmlns:comp="http://schemas.openxmlformats.org/drawingml/2006/compatibility" xmlns:lc="http://schemas.openxmlformats.org/drawingml/2006/lockedCanvas" SelectedStyle="\APASixthEditionOfficeOnline.xsl" StyleName="APA"/>
-</file>
-
-<file path=customXml/item4.xml><?xml version="1.0" encoding="utf-8"?>
-<p:properties xmlns:p="http://schemas.microsoft.com/office/2006/metadata/properties" xmlns:xsi="http://www.w3.org/2001/XMLSchema-instance" xmlns:pc="http://schemas.microsoft.com/office/infopath/2007/PartnerControls">
-  <documentManagement>
-    <FALLO xmlns="b68ea25f-4c5d-467c-a666-be04225f8e58" xsi:nil="true"/>
-    <ESTADODELEXPEDIENTE xmlns="b68ea25f-4c5d-467c-a666-be04225f8e58" xsi:nil="true"/>
-    <REVISOR1 xmlns="b68ea25f-4c5d-467c-a666-be04225f8e58" xsi:nil="true"/>
-    <GERENTE xmlns="b68ea25f-4c5d-467c-a666-be04225f8e58" xsi:nil="true"/>
-    <COMENTARIO xmlns="b68ea25f-4c5d-467c-a666-be04225f8e58" xsi:nil="true"/>
-    <TIPODEEXPEDIENTE xmlns="b68ea25f-4c5d-467c-a666-be04225f8e58" xsi:nil="true"/>
-    <REVISOR2 xmlns="b68ea25f-4c5d-467c-a666-be04225f8e58" xsi:nil="true"/>
-    <SUMILLA xmlns="b68ea25f-4c5d-467c-a666-be04225f8e58" xsi:nil="true"/>
-    <lcf76f155ced4ddcb4097134ff3c332f xmlns="b68ea25f-4c5d-467c-a666-be04225f8e58">
-      <Terms xmlns="http://schemas.microsoft.com/office/infopath/2007/PartnerControls"/>
-    </lcf76f155ced4ddcb4097134ff3c332f>
-    <TaxCatchAll xmlns="680c7679-6e7d-4828-b830-7705079186f8" xsi:nil="true"/>
-  </documentManagement>
-</p:properties>
-</file>
-
 <file path=customXml/itemProps1.xml><?xml version="1.0" encoding="utf-8"?>
-<ds:datastoreItem xmlns:ds="http://schemas.openxmlformats.org/officeDocument/2006/customXml" ds:itemID="{68F3670B-DF80-462D-B3BD-6C370F11B12A}">
-  <ds:schemaRefs>
-    <ds:schemaRef ds:uri="http://schemas.microsoft.com/office/2006/metadata/contentType"/>
-    <ds:schemaRef ds:uri="http://schemas.microsoft.com/office/2006/metadata/properties/metaAttributes"/>
-    <ds:schemaRef ds:uri="http://www.w3.org/2001/XMLSchema"/>
-    <ds:schemaRef ds:uri="http://schemas.microsoft.com/office/2006/metadata/properties"/>
-    <ds:schemaRef ds:uri="b68ea25f-4c5d-467c-a666-be04225f8e58"/>
-    <ds:schemaRef ds:uri="680c7679-6e7d-4828-b830-7705079186f8"/>
-    <ds:schemaRef ds:uri="d94663fc-0bbb-4c75-ad7b-31b0161adbbf"/>
-    <ds:schemaRef ds:uri="http://schemas.microsoft.com/office/2006/documentManagement/types"/>
-    <ds:schemaRef ds:uri="http://schemas.microsoft.com/office/infopath/2007/PartnerControls"/>
-    <ds:schemaRef ds:uri="http://schemas.openxmlformats.org/package/2006/metadata/core-properties"/>
-    <ds:schemaRef ds:uri="http://purl.org/dc/elements/1.1/"/>
-    <ds:schemaRef ds:uri="http://purl.org/dc/terms/"/>
-    <ds:schemaRef ds:uri="http://schemas.microsoft.com/internal/obd"/>
-  </ds:schemaRefs>
-</ds:datastoreItem>
-</file>
-
-<file path=customXml/itemProps2.xml><?xml version="1.0" encoding="utf-8"?>
 <ds:datastoreItem xmlns:ds="http://schemas.openxmlformats.org/officeDocument/2006/customXml" ds:itemID="{8CC94C80-F113-4E76-BC78-2D2BFE910EF6}">
   <ds:schemaRefs>
     <ds:schemaRef ds:uri="http://schemas.microsoft.com/sharepoint/v3/contenttype/forms"/>
@@ -10484,7 +10710,7 @@
 </ds:datastoreItem>
 </file>
 
-<file path=customXml/itemProps3.xml><?xml version="1.0" encoding="utf-8"?>
+<file path=customXml/itemProps2.xml><?xml version="1.0" encoding="utf-8"?>
 <ds:datastoreItem xmlns:ds="http://schemas.openxmlformats.org/officeDocument/2006/customXml" ds:itemID="{1832EA8B-51A8-4322-A9C2-10C1DC5CFA2F}">
   <ds:schemaRefs>
     <ds:schemaRef ds:uri="http://schemas.openxmlformats.org/wordprocessingml/2006/main"/>
@@ -10529,7 +10755,7 @@
 </ds:datastoreItem>
 </file>
 
-<file path=customXml/itemProps4.xml><?xml version="1.0" encoding="utf-8"?>
+<file path=customXml/itemProps3.xml><?xml version="1.0" encoding="utf-8"?>
 <ds:datastoreItem xmlns:ds="http://schemas.openxmlformats.org/officeDocument/2006/customXml" ds:itemID="{23B649F1-0E56-4D17-8AD4-DDB881CE4CFB}">
   <ds:schemaRefs>
     <ds:schemaRef ds:uri="http://schemas.microsoft.com/office/2006/metadata/properties"/>
@@ -10538,4 +10764,24 @@
     <ds:schemaRef ds:uri="680c7679-6e7d-4828-b830-7705079186f8"/>
   </ds:schemaRefs>
 </ds:datastoreItem>
+</file>
+
+<file path=customXml/itemProps4.xml><?xml version="1.0" encoding="utf-8"?>
+<ds:datastoreItem xmlns:ds="http://schemas.openxmlformats.org/officeDocument/2006/customXml" ds:itemID="{68F3670B-DF80-462D-B3BD-6C370F11B12A}">
+  <ds:schemaRefs>
+    <ds:schemaRef ds:uri="http://schemas.microsoft.com/office/2006/metadata/contentType"/>
+    <ds:schemaRef ds:uri="http://schemas.microsoft.com/office/2006/metadata/properties/metaAttributes"/>
+    <ds:schemaRef ds:uri="http://www.w3.org/2001/XMLSchema"/>
+    <ds:schemaRef ds:uri="http://schemas.microsoft.com/office/2006/metadata/properties"/>
+    <ds:schemaRef ds:uri="b68ea25f-4c5d-467c-a666-be04225f8e58"/>
+    <ds:schemaRef ds:uri="680c7679-6e7d-4828-b830-7705079186f8"/>
+    <ds:schemaRef ds:uri="d94663fc-0bbb-4c75-ad7b-31b0161adbbf"/>
+    <ds:schemaRef ds:uri="http://schemas.microsoft.com/office/2006/documentManagement/types"/>
+    <ds:schemaRef ds:uri="http://schemas.microsoft.com/office/infopath/2007/PartnerControls"/>
+    <ds:schemaRef ds:uri="http://schemas.openxmlformats.org/package/2006/metadata/core-properties"/>
+    <ds:schemaRef ds:uri="http://purl.org/dc/elements/1.1/"/>
+    <ds:schemaRef ds:uri="http://purl.org/dc/terms/"/>
+    <ds:schemaRef ds:uri="http://schemas.microsoft.com/internal/obd"/>
+  </ds:schemaRefs>
+</ds:datastoreItem>
 </file>
</xml_diff>